<commit_message>
committed changes for submission and materials updates
</commit_message>
<xml_diff>
--- a/ethics/260107_McHugh_EHSREC_Appendices_signed.docx
+++ b/ethics/260107_McHugh_EHSREC_Appendices_signed.docx
@@ -1359,7 +1359,15 @@
               </w:rPr>
             </w:pPr>
             <w:r>
-              <w:t>Department of Psychiatry, University of Oxford &amp; The Uehiro Oxford Institute, University of Oxford</w:t>
+              <w:t xml:space="preserve">Department of Psychiatry, University of Oxford &amp; The </w:t>
+            </w:r>
+            <w:proofErr w:type="spellStart"/>
+            <w:r>
+              <w:t>Uehiro</w:t>
+            </w:r>
+            <w:proofErr w:type="spellEnd"/>
+            <w:r>
+              <w:t xml:space="preserve"> Oxford Institute, University of Oxford</w:t>
             </w:r>
           </w:p>
         </w:tc>
@@ -1379,7 +1387,7 @@
                 <w14:ligatures w14:val="standardContextual"/>
               </w:rPr>
               <w:drawing>
-                <wp:inline distT="0" distB="0" distL="0" distR="0" wp14:anchorId="221DAD01" wp14:editId="1BFA993F">
+                <wp:inline distT="0" distB="0" distL="0" distR="0" wp14:anchorId="221DAD01" wp14:editId="23781157">
                   <wp:extent cx="982980" cy="647700"/>
                   <wp:effectExtent l="0" t="0" r="7620" b="0"/>
                   <wp:docPr id="1411930725" name="Picture 1"/>
@@ -2021,7 +2029,15 @@
               </w:rPr>
             </w:pPr>
             <w:r>
-              <w:t xml:space="preserve">Department of Psychology, University of Silesia in Katowice &amp; Perelman School of Medicine, ChatLab, University of Pennsylvania </w:t>
+              <w:t xml:space="preserve">Department of Psychology, University of Silesia in Katowice &amp; Perelman School of Medicine, </w:t>
+            </w:r>
+            <w:proofErr w:type="spellStart"/>
+            <w:r>
+              <w:t>ChatLab</w:t>
+            </w:r>
+            <w:proofErr w:type="spellEnd"/>
+            <w:r>
+              <w:t xml:space="preserve">, University of Pennsylvania </w:t>
             </w:r>
           </w:p>
         </w:tc>
@@ -2140,7 +2156,15 @@
               </w:rPr>
             </w:pPr>
             <w:r>
-              <w:t>Department of Psychology, Universidad de los Andes, Chile</w:t>
+              <w:t xml:space="preserve">Department of Psychology, Universidad de </w:t>
+            </w:r>
+            <w:proofErr w:type="spellStart"/>
+            <w:r>
+              <w:t>los</w:t>
+            </w:r>
+            <w:proofErr w:type="spellEnd"/>
+            <w:r>
+              <w:t xml:space="preserve"> Andes, Chile</w:t>
             </w:r>
           </w:p>
         </w:tc>
@@ -2460,7 +2484,27 @@
           <w:color w:val="000000"/>
           <w:shd w:val="clear" w:color="auto" w:fill="FFFFFF"/>
         </w:rPr>
-        <w:t>EHS REC Number:</w:t>
+        <w:t>EHSREC Number:</w:t>
+      </w:r>
+      <w:r>
+        <w:rPr>
+          <w:rStyle w:val="normaltextrun"/>
+          <w:b/>
+          <w:bCs/>
+          <w:color w:val="000000"/>
+          <w:shd w:val="clear" w:color="auto" w:fill="FFFFFF"/>
+        </w:rPr>
+        <w:t xml:space="preserve"> </w:t>
+      </w:r>
+      <w:r>
+        <w:rPr>
+          <w:rStyle w:val="s20"/>
+          <w:rFonts w:eastAsiaTheme="majorEastAsia"/>
+          <w:b/>
+          <w:bCs/>
+          <w:color w:val="000000"/>
+        </w:rPr>
+        <w:t>2026_01_16_EHS</w:t>
       </w:r>
     </w:p>
     <w:p>
@@ -2755,7 +2799,17 @@
           <w:bCs/>
           <w:color w:val="000000"/>
         </w:rPr>
-        <w:t>This research study has received Ethics approval from the Education and Health Sciences Research Ethics Committee EHS REC “-“</w:t>
+        <w:t xml:space="preserve">This research study has received Ethics approval from the Education and Health Sciences Research Ethics Committee EHSREC </w:t>
+      </w:r>
+      <w:r>
+        <w:rPr>
+          <w:rStyle w:val="s20"/>
+          <w:rFonts w:eastAsiaTheme="majorEastAsia"/>
+          <w:b/>
+          <w:bCs/>
+          <w:color w:val="000000"/>
+        </w:rPr>
+        <w:t>2026_01_16_EHS</w:t>
       </w:r>
     </w:p>
     <w:p>
@@ -2963,15 +3017,39 @@
           <w:lang w:val="fr-BE"/>
         </w:rPr>
         <w:lastRenderedPageBreak/>
-        <w:t xml:space="preserve">Appendix C: </w:t>
-      </w:r>
-      <w:r>
-        <w:rPr>
+        <w:t xml:space="preserve">Appendix </w:t>
+      </w:r>
+      <w:proofErr w:type="gramStart"/>
+      <w:r>
+        <w:rPr>
+          <w:color w:val="000000" w:themeColor="text1"/>
           <w:lang w:val="fr-BE"/>
         </w:rPr>
-        <w:t>Participant Information Sheet</w:t>
+        <w:t>C:</w:t>
+      </w:r>
+      <w:proofErr w:type="gramEnd"/>
+      <w:r>
+        <w:rPr>
+          <w:color w:val="000000" w:themeColor="text1"/>
+          <w:lang w:val="fr-BE"/>
+        </w:rPr>
+        <w:t xml:space="preserve"> </w:t>
+      </w:r>
+      <w:r>
+        <w:rPr>
+          <w:lang w:val="fr-BE"/>
+        </w:rPr>
+        <w:t xml:space="preserve">Participant Information </w:t>
+      </w:r>
+      <w:proofErr w:type="spellStart"/>
+      <w:r>
+        <w:rPr>
+          <w:lang w:val="fr-BE"/>
+        </w:rPr>
+        <w:t>Sheet</w:t>
       </w:r>
       <w:bookmarkEnd w:id="2"/>
+      <w:proofErr w:type="spellEnd"/>
     </w:p>
     <w:p>
       <w:pPr>
@@ -3056,6 +3134,26 @@
         </w:rPr>
         <w:t>EHSREC Number:</w:t>
       </w:r>
+      <w:r>
+        <w:rPr>
+          <w:rStyle w:val="normaltextrun"/>
+          <w:b/>
+          <w:bCs/>
+          <w:color w:val="000000"/>
+          <w:shd w:val="clear" w:color="auto" w:fill="FFFFFF"/>
+        </w:rPr>
+        <w:t xml:space="preserve"> </w:t>
+      </w:r>
+      <w:r>
+        <w:rPr>
+          <w:rStyle w:val="s20"/>
+          <w:rFonts w:eastAsiaTheme="majorEastAsia"/>
+          <w:b/>
+          <w:bCs/>
+          <w:color w:val="000000"/>
+        </w:rPr>
+        <w:t>2026_01_16_EHS</w:t>
+      </w:r>
     </w:p>
     <w:p>
       <w:pPr>
@@ -3332,7 +3430,39 @@
           <w:shd w:val="clear" w:color="auto" w:fill="FFFFFF"/>
         </w:rPr>
         <w:lastRenderedPageBreak/>
-        <w:t>potentially cause offense. Specifically, some of the scenarios you will be asked to respond to contain descriptions of behaviours that you may find morally wrong or morally offensive. The anticipated risk is comparable to that you could reasonably expect from an 18 rated movie or TV show.</w:t>
+        <w:t xml:space="preserve">potentially cause offense. Specifically, some of the scenarios you will be asked to respond to contain descriptions of </w:t>
+      </w:r>
+      <w:proofErr w:type="spellStart"/>
+      <w:r>
+        <w:rPr>
+          <w:color w:val="32363A"/>
+          <w:shd w:val="clear" w:color="auto" w:fill="FFFFFF"/>
+        </w:rPr>
+        <w:t>behaviours</w:t>
+      </w:r>
+      <w:proofErr w:type="spellEnd"/>
+      <w:r>
+        <w:rPr>
+          <w:color w:val="32363A"/>
+          <w:shd w:val="clear" w:color="auto" w:fill="FFFFFF"/>
+        </w:rPr>
+        <w:t xml:space="preserve"> that you may find morally wrong or morally offensive. The anticipated risk is comparable to that you could reasonably expect from an </w:t>
+      </w:r>
+      <w:proofErr w:type="gramStart"/>
+      <w:r>
+        <w:rPr>
+          <w:color w:val="32363A"/>
+          <w:shd w:val="clear" w:color="auto" w:fill="FFFFFF"/>
+        </w:rPr>
+        <w:t>18 rated</w:t>
+      </w:r>
+      <w:proofErr w:type="gramEnd"/>
+      <w:r>
+        <w:rPr>
+          <w:color w:val="32363A"/>
+          <w:shd w:val="clear" w:color="auto" w:fill="FFFFFF"/>
+        </w:rPr>
+        <w:t xml:space="preserve"> movie or TV show.</w:t>
       </w:r>
       <w:r>
         <w:rPr>
@@ -3412,7 +3542,39 @@
           <w:color w:val="32363A"/>
           <w:shd w:val="clear" w:color="auto" w:fill="FFFFFF"/>
         </w:rPr>
-        <w:t>Participation is voluntary so you do not have to take part in the study if you do not want to; there is no penalty for not participating. If you decide to take part and then change your mind you can withdraw from the study at any point without giving a reason. Please note that if you do choose to withdraw once you have begun the study, it will not be possible to remove any responses already provided. This is because the responses are fully anonymized on collection, and it will not be possible to isolate your responses from the remainder of the data collected. The primary analysis will require complete responses and therefore partially complete responses will be excluded from these analyses. However, partial responses will likely be included in some analysis when they include responses to measures of interest.</w:t>
+        <w:t xml:space="preserve">Participation is </w:t>
+      </w:r>
+      <w:proofErr w:type="gramStart"/>
+      <w:r>
+        <w:rPr>
+          <w:color w:val="32363A"/>
+          <w:shd w:val="clear" w:color="auto" w:fill="FFFFFF"/>
+        </w:rPr>
+        <w:t>voluntary</w:t>
+      </w:r>
+      <w:proofErr w:type="gramEnd"/>
+      <w:r>
+        <w:rPr>
+          <w:color w:val="32363A"/>
+          <w:shd w:val="clear" w:color="auto" w:fill="FFFFFF"/>
+        </w:rPr>
+        <w:t xml:space="preserve"> so you do not have to take part in the study if you do not want to; there is no penalty for not participating. If you decide to take part and then change your mind you can withdraw </w:t>
+      </w:r>
+      <w:proofErr w:type="gramStart"/>
+      <w:r>
+        <w:rPr>
+          <w:color w:val="32363A"/>
+          <w:shd w:val="clear" w:color="auto" w:fill="FFFFFF"/>
+        </w:rPr>
+        <w:t>from the study</w:t>
+      </w:r>
+      <w:proofErr w:type="gramEnd"/>
+      <w:r>
+        <w:rPr>
+          <w:color w:val="32363A"/>
+          <w:shd w:val="clear" w:color="auto" w:fill="FFFFFF"/>
+        </w:rPr>
+        <w:t xml:space="preserve"> at any point without giving a reason. Please note that if you do choose to withdraw once you have begun the study, it will not be possible to remove any responses already provided. This is because the responses are fully anonymized on collection, and it will not be possible to isolate your responses from the remainder of the data collected. The primary analysis will require complete responses and therefore partially complete responses will be excluded from these analyses. However, partial responses will likely be included in some analysis when they include responses to measures of interest.</w:t>
       </w:r>
       <w:r>
         <w:rPr>
@@ -3480,7 +3642,23 @@
           <w:color w:val="32363A"/>
           <w:shd w:val="clear" w:color="auto" w:fill="FFFFFF"/>
         </w:rPr>
-        <w:t>Raw anonymized data will be stored for the duration of this study. All data will be fully anonymized on collection and stored on GDPR compliant OneDrive accounts accessible only by the named researchers on this project. All cleaned and processed data will be stored indefinitely and made available to other researchers through the open science framework.</w:t>
+        <w:t xml:space="preserve">Raw anonymized data will be stored for the duration of this study. All data will be fully anonymized </w:t>
+      </w:r>
+      <w:proofErr w:type="gramStart"/>
+      <w:r>
+        <w:rPr>
+          <w:color w:val="32363A"/>
+          <w:shd w:val="clear" w:color="auto" w:fill="FFFFFF"/>
+        </w:rPr>
+        <w:t>on</w:t>
+      </w:r>
+      <w:proofErr w:type="gramEnd"/>
+      <w:r>
+        <w:rPr>
+          <w:color w:val="32363A"/>
+          <w:shd w:val="clear" w:color="auto" w:fill="FFFFFF"/>
+        </w:rPr>
+        <w:t xml:space="preserve"> collection and stored on GDPR compliant OneDrive accounts accessible only by the named researchers on this project. All cleaned and processed data will be stored indefinitely and made available to other researchers through the open science framework.</w:t>
       </w:r>
       <w:r>
         <w:rPr>
@@ -3696,7 +3874,23 @@
           <w:color w:val="32363A"/>
           <w:shd w:val="clear" w:color="auto" w:fill="FFFFFF"/>
         </w:rPr>
-        <w:t>Department of Psychiatry, University of Oxford &amp; The Uehiro Oxford Institute, University of Oxford</w:t>
+        <w:t xml:space="preserve">Department of Psychiatry, University of Oxford &amp; The </w:t>
+      </w:r>
+      <w:proofErr w:type="spellStart"/>
+      <w:r>
+        <w:rPr>
+          <w:color w:val="32363A"/>
+          <w:shd w:val="clear" w:color="auto" w:fill="FFFFFF"/>
+        </w:rPr>
+        <w:t>Uehiro</w:t>
+      </w:r>
+      <w:proofErr w:type="spellEnd"/>
+      <w:r>
+        <w:rPr>
+          <w:color w:val="32363A"/>
+          <w:shd w:val="clear" w:color="auto" w:fill="FFFFFF"/>
+        </w:rPr>
+        <w:t xml:space="preserve"> Oxford Institute, University of Oxford</w:t>
       </w:r>
     </w:p>
     <w:p>
@@ -3715,55 +3909,65 @@
         </w:rPr>
         <w:t>Ana Gantman (</w:t>
       </w:r>
+      <w:r>
+        <w:fldChar w:fldCharType="begin"/>
+      </w:r>
+      <w:r>
+        <w:instrText>HYPERLINK "mailto:ana.gantman@brooklyn.cuny.edu" \h</w:instrText>
+      </w:r>
+      <w:r>
+        <w:fldChar w:fldCharType="separate"/>
+      </w:r>
+      <w:r>
+        <w:rPr>
+          <w:rStyle w:val="Hyperlink"/>
+          <w:shd w:val="clear" w:color="auto" w:fill="FFFFFF"/>
+          <w:lang w:val="pl-PL"/>
+        </w:rPr>
+        <w:t>ana.gantman@brooklyn.cuny.edu</w:t>
+      </w:r>
+      <w:r>
+        <w:fldChar w:fldCharType="end"/>
+      </w:r>
+      <w:r>
+        <w:rPr>
+          <w:color w:val="32363A"/>
+          <w:shd w:val="clear" w:color="auto" w:fill="FFFFFF"/>
+          <w:lang w:val="pl-PL"/>
+        </w:rPr>
+        <w:t xml:space="preserve">) </w:t>
+      </w:r>
+    </w:p>
+    <w:p>
+      <w:pPr>
+        <w:rPr>
+          <w:color w:val="32363A"/>
+          <w:shd w:val="clear" w:color="auto" w:fill="FFFFFF"/>
+        </w:rPr>
+      </w:pPr>
+      <w:r>
+        <w:rPr>
+          <w:color w:val="32363A"/>
+          <w:shd w:val="clear" w:color="auto" w:fill="FFFFFF"/>
+        </w:rPr>
+        <w:t>Department of Psychology, Brooklyn College CUNY</w:t>
+      </w:r>
+    </w:p>
+    <w:p>
+      <w:pPr>
+        <w:rPr>
+          <w:color w:val="32363A"/>
+          <w:shd w:val="clear" w:color="auto" w:fill="FFFFFF"/>
+        </w:rPr>
+      </w:pPr>
+      <w:r>
+        <w:rPr>
+          <w:color w:val="32363A"/>
+          <w:shd w:val="clear" w:color="auto" w:fill="FFFFFF"/>
+        </w:rPr>
+        <w:t>Eric R. Igou (</w:t>
+      </w:r>
       <w:hyperlink r:id="rId23">
-        <w:r>
-          <w:rPr>
-            <w:rStyle w:val="Hyperlink"/>
-            <w:shd w:val="clear" w:color="auto" w:fill="FFFFFF"/>
-            <w:lang w:val="pl-PL"/>
-          </w:rPr>
-          <w:t>ana.gantman@brooklyn.cuny.edu</w:t>
-        </w:r>
-      </w:hyperlink>
-      <w:r>
-        <w:rPr>
-          <w:color w:val="32363A"/>
-          <w:shd w:val="clear" w:color="auto" w:fill="FFFFFF"/>
-          <w:lang w:val="pl-PL"/>
-        </w:rPr>
-        <w:t xml:space="preserve">) </w:t>
-      </w:r>
-    </w:p>
-    <w:p>
-      <w:pPr>
-        <w:rPr>
-          <w:color w:val="32363A"/>
-          <w:shd w:val="clear" w:color="auto" w:fill="FFFFFF"/>
-        </w:rPr>
-      </w:pPr>
-      <w:r>
-        <w:rPr>
-          <w:color w:val="32363A"/>
-          <w:shd w:val="clear" w:color="auto" w:fill="FFFFFF"/>
-        </w:rPr>
-        <w:t>Department of Psychology, Brooklyn College CUNY</w:t>
-      </w:r>
-    </w:p>
-    <w:p>
-      <w:pPr>
-        <w:rPr>
-          <w:color w:val="32363A"/>
-          <w:shd w:val="clear" w:color="auto" w:fill="FFFFFF"/>
-        </w:rPr>
-      </w:pPr>
-      <w:r>
-        <w:rPr>
-          <w:color w:val="32363A"/>
-          <w:shd w:val="clear" w:color="auto" w:fill="FFFFFF"/>
-        </w:rPr>
-        <w:t>Eric R. Igou (</w:t>
-      </w:r>
-      <w:hyperlink r:id="rId24">
         <w:r>
           <w:rPr>
             <w:rStyle w:val="Hyperlink"/>
@@ -3810,7 +4014,7 @@
         </w:rPr>
         <w:t>Elaine L. Kinsella (</w:t>
       </w:r>
-      <w:hyperlink r:id="rId25">
+      <w:hyperlink r:id="rId24">
         <w:r>
           <w:rPr>
             <w:rStyle w:val="Hyperlink"/>
@@ -3858,22 +4062,32 @@
         </w:rPr>
         <w:t>Marek McGann (</w:t>
       </w:r>
-      <w:hyperlink r:id="rId26">
-        <w:r>
-          <w:rPr>
-            <w:rStyle w:val="Hyperlink"/>
-            <w:shd w:val="clear" w:color="auto" w:fill="FFFFFF"/>
-            <w:lang w:val="pl-PL"/>
-          </w:rPr>
-          <w:t>marek.mcgann@mic.ul.ie</w:t>
-        </w:r>
-      </w:hyperlink>
-      <w:r>
-        <w:rPr>
-          <w:color w:val="32363A"/>
+      <w:r>
+        <w:fldChar w:fldCharType="begin"/>
+      </w:r>
+      <w:r>
+        <w:instrText>HYPERLINK "mailto:marek.mcgann@mic.ul.ie" \h</w:instrText>
+      </w:r>
+      <w:r>
+        <w:fldChar w:fldCharType="separate"/>
+      </w:r>
+      <w:r>
+        <w:rPr>
+          <w:rStyle w:val="Hyperlink"/>
           <w:shd w:val="clear" w:color="auto" w:fill="FFFFFF"/>
           <w:lang w:val="pl-PL"/>
         </w:rPr>
+        <w:t>marek.mcgann@mic.ul.ie</w:t>
+      </w:r>
+      <w:r>
+        <w:fldChar w:fldCharType="end"/>
+      </w:r>
+      <w:r>
+        <w:rPr>
+          <w:color w:val="32363A"/>
+          <w:shd w:val="clear" w:color="auto" w:fill="FFFFFF"/>
+          <w:lang w:val="pl-PL"/>
+        </w:rPr>
         <w:t xml:space="preserve">) </w:t>
       </w:r>
     </w:p>
@@ -3908,22 +4122,32 @@
         </w:rPr>
         <w:t>Bryan C.Y. Pang (</w:t>
       </w:r>
-      <w:hyperlink r:id="rId27">
-        <w:r>
-          <w:rPr>
-            <w:rStyle w:val="Hyperlink"/>
-            <w:shd w:val="clear" w:color="auto" w:fill="FFFFFF"/>
-            <w:lang w:val="pl-PL"/>
-          </w:rPr>
-          <w:t>bryan.pang2506@gmail.com</w:t>
-        </w:r>
-      </w:hyperlink>
-      <w:r>
-        <w:rPr>
-          <w:color w:val="32363A"/>
+      <w:r>
+        <w:fldChar w:fldCharType="begin"/>
+      </w:r>
+      <w:r>
+        <w:instrText>HYPERLINK "mailto:bryan.pang2506@gmail.com" \h</w:instrText>
+      </w:r>
+      <w:r>
+        <w:fldChar w:fldCharType="separate"/>
+      </w:r>
+      <w:r>
+        <w:rPr>
+          <w:rStyle w:val="Hyperlink"/>
           <w:shd w:val="clear" w:color="auto" w:fill="FFFFFF"/>
           <w:lang w:val="pl-PL"/>
         </w:rPr>
+        <w:t>bryan.pang2506@gmail.com</w:t>
+      </w:r>
+      <w:r>
+        <w:fldChar w:fldCharType="end"/>
+      </w:r>
+      <w:r>
+        <w:rPr>
+          <w:color w:val="32363A"/>
+          <w:shd w:val="clear" w:color="auto" w:fill="FFFFFF"/>
+          <w:lang w:val="pl-PL"/>
+        </w:rPr>
         <w:t xml:space="preserve">) </w:t>
       </w:r>
     </w:p>
@@ -3958,22 +4182,32 @@
         </w:rPr>
         <w:t>Mariola Paruzel-Czachura (</w:t>
       </w:r>
-      <w:hyperlink r:id="rId28">
-        <w:r>
-          <w:rPr>
-            <w:rStyle w:val="Hyperlink"/>
-            <w:shd w:val="clear" w:color="auto" w:fill="FFFFFF"/>
-            <w:lang w:val="pl-PL"/>
-          </w:rPr>
-          <w:t>mariola.paruzel-czachura@us.edu.pl</w:t>
-        </w:r>
-      </w:hyperlink>
-      <w:r>
-        <w:rPr>
-          <w:color w:val="32363A"/>
+      <w:r>
+        <w:fldChar w:fldCharType="begin"/>
+      </w:r>
+      <w:r>
+        <w:instrText>HYPERLINK "mailto:mariola.paruzel-czachura@us.edu.pl" \h</w:instrText>
+      </w:r>
+      <w:r>
+        <w:fldChar w:fldCharType="separate"/>
+      </w:r>
+      <w:r>
+        <w:rPr>
+          <w:rStyle w:val="Hyperlink"/>
           <w:shd w:val="clear" w:color="auto" w:fill="FFFFFF"/>
           <w:lang w:val="pl-PL"/>
         </w:rPr>
+        <w:t>mariola.paruzel-czachura@us.edu.pl</w:t>
+      </w:r>
+      <w:r>
+        <w:fldChar w:fldCharType="end"/>
+      </w:r>
+      <w:r>
+        <w:rPr>
+          <w:color w:val="32363A"/>
+          <w:shd w:val="clear" w:color="auto" w:fill="FFFFFF"/>
+          <w:lang w:val="pl-PL"/>
+        </w:rPr>
         <w:t xml:space="preserve">) </w:t>
       </w:r>
     </w:p>
@@ -3989,7 +4223,23 @@
           <w:color w:val="32363A"/>
           <w:shd w:val="clear" w:color="auto" w:fill="FFFFFF"/>
         </w:rPr>
-        <w:t xml:space="preserve">Department of Psychology, University of Silesia in Katowice &amp; Perelman School of Medicine, ChatLab, University of Pennsylvania </w:t>
+        <w:t xml:space="preserve">Department of Psychology, University of Silesia in Katowice &amp; Perelman School of Medicine, </w:t>
+      </w:r>
+      <w:proofErr w:type="spellStart"/>
+      <w:r>
+        <w:rPr>
+          <w:color w:val="32363A"/>
+          <w:shd w:val="clear" w:color="auto" w:fill="FFFFFF"/>
+        </w:rPr>
+        <w:t>ChatLab</w:t>
+      </w:r>
+      <w:proofErr w:type="spellEnd"/>
+      <w:r>
+        <w:rPr>
+          <w:color w:val="32363A"/>
+          <w:shd w:val="clear" w:color="auto" w:fill="FFFFFF"/>
+        </w:rPr>
+        <w:t xml:space="preserve">, University of Pennsylvania </w:t>
       </w:r>
     </w:p>
     <w:p>
@@ -4008,7 +4258,7 @@
         </w:rPr>
         <w:t>Cristián G. Rodríguez (</w:t>
       </w:r>
-      <w:hyperlink r:id="rId29">
+      <w:hyperlink r:id="rId25">
         <w:r>
           <w:rPr>
             <w:rStyle w:val="Hyperlink"/>
@@ -4039,7 +4289,23 @@
           <w:color w:val="32363A"/>
           <w:shd w:val="clear" w:color="auto" w:fill="FFFFFF"/>
         </w:rPr>
-        <w:t xml:space="preserve">Department of Psychology, Universidad de los Andes, Chile </w:t>
+        <w:t xml:space="preserve">Department of Psychology, Universidad de </w:t>
+      </w:r>
+      <w:proofErr w:type="spellStart"/>
+      <w:r>
+        <w:rPr>
+          <w:color w:val="32363A"/>
+          <w:shd w:val="clear" w:color="auto" w:fill="FFFFFF"/>
+        </w:rPr>
+        <w:t>los</w:t>
+      </w:r>
+      <w:proofErr w:type="spellEnd"/>
+      <w:r>
+        <w:rPr>
+          <w:color w:val="32363A"/>
+          <w:shd w:val="clear" w:color="auto" w:fill="FFFFFF"/>
+        </w:rPr>
+        <w:t xml:space="preserve"> Andes, Chile </w:t>
       </w:r>
     </w:p>
     <w:p>
@@ -4061,7 +4327,7 @@
         </w:rPr>
         <w:t>Jordan Wylie (</w:t>
       </w:r>
-      <w:hyperlink r:id="rId30">
+      <w:hyperlink r:id="rId26">
         <w:r>
           <w:rPr>
             <w:rStyle w:val="Hyperlink"/>
@@ -4127,7 +4393,53 @@
           <w:color w:val="32363A"/>
           <w:shd w:val="clear" w:color="auto" w:fill="FFFFFF"/>
         </w:rPr>
-        <w:t>This research study has received Ethics approval from the Education and Health Sciences Research Ethics Committee (“-“). If you have any concerns about this study and wish to contact someone independent you may contact:</w:t>
+        <w:t>This research study has received Ethics approval from the Education and Health Sciences Research Ethics Committee (</w:t>
+      </w:r>
+      <w:r>
+        <w:rPr>
+          <w:b/>
+          <w:bCs/>
+          <w:i/>
+          <w:iCs/>
+          <w:color w:val="32363A"/>
+          <w:shd w:val="clear" w:color="auto" w:fill="FFFFFF"/>
+        </w:rPr>
+        <w:t>2026_01_16_EHS</w:t>
+      </w:r>
+      <w:r>
+        <w:rPr>
+          <w:b/>
+          <w:bCs/>
+          <w:i/>
+          <w:iCs/>
+          <w:color w:val="32363A"/>
+          <w:shd w:val="clear" w:color="auto" w:fill="FFFFFF"/>
+        </w:rPr>
+        <w:t xml:space="preserve">). If you have any concerns about this study and wish to contact someone </w:t>
+      </w:r>
+      <w:proofErr w:type="gramStart"/>
+      <w:r>
+        <w:rPr>
+          <w:b/>
+          <w:bCs/>
+          <w:i/>
+          <w:iCs/>
+          <w:color w:val="32363A"/>
+          <w:shd w:val="clear" w:color="auto" w:fill="FFFFFF"/>
+        </w:rPr>
+        <w:t>independent</w:t>
+      </w:r>
+      <w:proofErr w:type="gramEnd"/>
+      <w:r>
+        <w:rPr>
+          <w:b/>
+          <w:bCs/>
+          <w:i/>
+          <w:iCs/>
+          <w:color w:val="32363A"/>
+          <w:shd w:val="clear" w:color="auto" w:fill="FFFFFF"/>
+        </w:rPr>
+        <w:t xml:space="preserve"> you may contact:</w:t>
       </w:r>
       <w:r>
         <w:rPr>
@@ -4279,6 +4591,26 @@
         </w:rPr>
         <w:t>EHSREC Number:</w:t>
       </w:r>
+      <w:r>
+        <w:rPr>
+          <w:rStyle w:val="normaltextrun"/>
+          <w:b/>
+          <w:bCs/>
+          <w:color w:val="000000"/>
+          <w:shd w:val="clear" w:color="auto" w:fill="FFFFFF"/>
+        </w:rPr>
+        <w:t xml:space="preserve"> </w:t>
+      </w:r>
+      <w:r>
+        <w:rPr>
+          <w:rStyle w:val="s20"/>
+          <w:rFonts w:eastAsiaTheme="majorEastAsia"/>
+          <w:b/>
+          <w:bCs/>
+          <w:color w:val="000000"/>
+        </w:rPr>
+        <w:t>2026_01_16_EHS</w:t>
+      </w:r>
     </w:p>
     <w:p>
       <w:pPr>
@@ -4684,6 +5016,26 @@
         </w:rPr>
         <w:t>EHSREC Number:</w:t>
       </w:r>
+      <w:r>
+        <w:rPr>
+          <w:rStyle w:val="normaltextrun"/>
+          <w:b/>
+          <w:bCs/>
+          <w:color w:val="000000"/>
+          <w:shd w:val="clear" w:color="auto" w:fill="FFFFFF"/>
+        </w:rPr>
+        <w:t xml:space="preserve"> </w:t>
+      </w:r>
+      <w:r>
+        <w:rPr>
+          <w:rStyle w:val="s20"/>
+          <w:rFonts w:eastAsiaTheme="majorEastAsia"/>
+          <w:b/>
+          <w:bCs/>
+          <w:color w:val="000000"/>
+        </w:rPr>
+        <w:t>2026_01_16_EHS</w:t>
+      </w:r>
     </w:p>
     <w:p>
       <w:pPr>
@@ -4705,7 +5057,23 @@
           <w:color w:val="32363A"/>
           <w:shd w:val="clear" w:color="auto" w:fill="FFFFFF"/>
         </w:rPr>
-        <w:t>We thank you for you participation in this study.</w:t>
+        <w:t xml:space="preserve">We thank you for </w:t>
+      </w:r>
+      <w:proofErr w:type="gramStart"/>
+      <w:r>
+        <w:rPr>
+          <w:color w:val="32363A"/>
+          <w:shd w:val="clear" w:color="auto" w:fill="FFFFFF"/>
+        </w:rPr>
+        <w:t>you</w:t>
+      </w:r>
+      <w:proofErr w:type="gramEnd"/>
+      <w:r>
+        <w:rPr>
+          <w:color w:val="32363A"/>
+          <w:shd w:val="clear" w:color="auto" w:fill="FFFFFF"/>
+        </w:rPr>
+        <w:t xml:space="preserve"> participation in this study.</w:t>
       </w:r>
       <w:r>
         <w:rPr>
@@ -4766,24 +5134,19 @@
           <w:color w:val="32363A"/>
           <w:shd w:val="clear" w:color="auto" w:fill="FFFFFF"/>
         </w:rPr>
-        <w:t>One way that might help people think of reasons is to think about things in the distant future. In this study, some people were asked to think about these scenarios in the distant future, and some people were asked to think about them in the near future, and some were not given explicit instructions. We want to see if thinking about things in the distant future helps people provide reasons for their moral judgements.</w:t>
-      </w:r>
-    </w:p>
-    <w:p>
-      <w:pPr>
+        <w:t xml:space="preserve">One way that might help people think of reasons is to think about things in the distant future. In this study, some people were asked to think about these scenarios in the distant future, and some people were asked to think about them </w:t>
+      </w:r>
+      <w:proofErr w:type="gramStart"/>
+      <w:r>
         <w:rPr>
           <w:i/>
           <w:iCs/>
           <w:color w:val="32363A"/>
-        </w:rPr>
-      </w:pPr>
-      <w:r>
-        <w:rPr>
-          <w:color w:val="32363A"/>
-          <w:shd w:val="clear" w:color="auto" w:fill="FFFFFF"/>
-        </w:rPr>
-        <w:t>[Study 2] O</w:t>
-      </w:r>
+          <w:shd w:val="clear" w:color="auto" w:fill="FFFFFF"/>
+        </w:rPr>
+        <w:t>in the near future</w:t>
+      </w:r>
+      <w:proofErr w:type="gramEnd"/>
       <w:r>
         <w:rPr>
           <w:i/>
@@ -4791,60 +5154,85 @@
           <w:color w:val="32363A"/>
           <w:shd w:val="clear" w:color="auto" w:fill="FFFFFF"/>
         </w:rPr>
-        <w:t xml:space="preserve">ne way that might help people think of reasons is to adopt a more abstract mindset (compared to a more concrete mindset). In this study, there was mindset task before the moral judgement task that was designed to encourage either a more abstract or a more concrete mindset (by thinking about either “why” we do things, or “how” we can do things). Some people were encouraged to think more abstractly while others were encouraged to think more concretely. We want to see if a more abstract mindset can help people to provide reasons for their moral judgements. </w:t>
-      </w:r>
-    </w:p>
-    <w:p>
-      <w:pPr>
-        <w:rPr>
-          <w:color w:val="32363A"/>
-          <w:shd w:val="clear" w:color="auto" w:fill="FFFFFF"/>
-        </w:rPr>
-      </w:pPr>
-    </w:p>
-    <w:p>
-      <w:pPr>
-        <w:rPr>
-          <w:color w:val="32363A"/>
-          <w:shd w:val="clear" w:color="auto" w:fill="FFFFFF"/>
-        </w:rPr>
-      </w:pPr>
-      <w:r>
-        <w:rPr>
-          <w:color w:val="32363A"/>
-          <w:shd w:val="clear" w:color="auto" w:fill="FFFFFF"/>
-        </w:rPr>
-        <w:t>We are also interested in how moral dumbfounding varies in different countries. We are conducting this study in Ireland, Poland, Chile, Belgium, USA, UK, and Hong Kong.</w:t>
-      </w:r>
-    </w:p>
-    <w:p>
-      <w:pPr>
-        <w:rPr>
-          <w:color w:val="32363A"/>
-          <w:shd w:val="clear" w:color="auto" w:fill="FFFFFF"/>
-        </w:rPr>
-      </w:pPr>
-    </w:p>
-    <w:p>
-      <w:pPr>
-        <w:rPr>
-          <w:b/>
-          <w:bCs/>
+        <w:t>, and some were not given explicit instructions. We want to see if thinking about things in the distant future helps people provide reasons for their moral judgements.</w:t>
+      </w:r>
+    </w:p>
+    <w:p>
+      <w:pPr>
+        <w:rPr>
           <w:i/>
           <w:iCs/>
           <w:color w:val="32363A"/>
-          <w:shd w:val="clear" w:color="auto" w:fill="FFFFFF"/>
-        </w:rPr>
-      </w:pPr>
-      <w:r>
-        <w:rPr>
-          <w:b/>
-          <w:bCs/>
+        </w:rPr>
+      </w:pPr>
+      <w:r>
+        <w:rPr>
+          <w:color w:val="32363A"/>
+          <w:shd w:val="clear" w:color="auto" w:fill="FFFFFF"/>
+        </w:rPr>
+        <w:t>[Study 2] O</w:t>
+      </w:r>
+      <w:r>
+        <w:rPr>
           <w:i/>
           <w:iCs/>
           <w:color w:val="32363A"/>
           <w:shd w:val="clear" w:color="auto" w:fill="FFFFFF"/>
         </w:rPr>
+        <w:t xml:space="preserve">ne way that might help people think of reasons is to adopt a more abstract mindset (compared to a more concrete mindset). In this study, there was mindset task before the moral judgement task that was designed to encourage either a more abstract or a more concrete mindset (by thinking about either “why” we do things, or “how” we can do things). Some people were encouraged to think more abstractly while others were encouraged to think more concretely. We want to see if a more abstract mindset can help people to provide reasons for their moral judgements. </w:t>
+      </w:r>
+    </w:p>
+    <w:p>
+      <w:pPr>
+        <w:rPr>
+          <w:color w:val="32363A"/>
+          <w:shd w:val="clear" w:color="auto" w:fill="FFFFFF"/>
+        </w:rPr>
+      </w:pPr>
+    </w:p>
+    <w:p>
+      <w:pPr>
+        <w:rPr>
+          <w:color w:val="32363A"/>
+          <w:shd w:val="clear" w:color="auto" w:fill="FFFFFF"/>
+        </w:rPr>
+      </w:pPr>
+      <w:r>
+        <w:rPr>
+          <w:color w:val="32363A"/>
+          <w:shd w:val="clear" w:color="auto" w:fill="FFFFFF"/>
+        </w:rPr>
+        <w:t>We are also interested in how moral dumbfounding varies in different countries. We are conducting this study in Ireland, Poland, Chile, Belgium, USA, UK, and Hong Kong.</w:t>
+      </w:r>
+    </w:p>
+    <w:p>
+      <w:pPr>
+        <w:rPr>
+          <w:color w:val="32363A"/>
+          <w:shd w:val="clear" w:color="auto" w:fill="FFFFFF"/>
+        </w:rPr>
+      </w:pPr>
+    </w:p>
+    <w:p>
+      <w:pPr>
+        <w:rPr>
+          <w:b/>
+          <w:bCs/>
+          <w:i/>
+          <w:iCs/>
+          <w:color w:val="32363A"/>
+          <w:shd w:val="clear" w:color="auto" w:fill="FFFFFF"/>
+        </w:rPr>
+      </w:pPr>
+      <w:r>
+        <w:rPr>
+          <w:b/>
+          <w:bCs/>
+          <w:i/>
+          <w:iCs/>
+          <w:color w:val="32363A"/>
+          <w:shd w:val="clear" w:color="auto" w:fill="FFFFFF"/>
+        </w:rPr>
         <w:t>Study 3</w:t>
       </w:r>
     </w:p>
@@ -4946,7 +5334,7 @@
         </w:rPr>
         <w:t>Cillian McHugh (</w:t>
       </w:r>
-      <w:hyperlink r:id="rId31">
+      <w:hyperlink r:id="rId27">
         <w:r>
           <w:rPr>
             <w:rStyle w:val="Hyperlink"/>
@@ -5012,7 +5400,7 @@
         </w:rPr>
         <w:t>Dries Bostyn (</w:t>
       </w:r>
-      <w:hyperlink r:id="rId32">
+      <w:hyperlink r:id="rId28">
         <w:r>
           <w:rPr>
             <w:rStyle w:val="Hyperlink"/>
@@ -5058,7 +5446,7 @@
         </w:rPr>
         <w:t>Kathryn B. Francis (</w:t>
       </w:r>
-      <w:hyperlink r:id="rId33">
+      <w:hyperlink r:id="rId29">
         <w:r>
           <w:rPr>
             <w:rStyle w:val="Hyperlink"/>
@@ -5087,7 +5475,23 @@
           <w:color w:val="32363A"/>
           <w:shd w:val="clear" w:color="auto" w:fill="FFFFFF"/>
         </w:rPr>
-        <w:t>Department of Psychiatry, University of Oxford &amp; The Uehiro Oxford Institute, University of Oxford</w:t>
+        <w:t xml:space="preserve">Department of Psychiatry, University of Oxford &amp; The </w:t>
+      </w:r>
+      <w:proofErr w:type="spellStart"/>
+      <w:r>
+        <w:rPr>
+          <w:color w:val="32363A"/>
+          <w:shd w:val="clear" w:color="auto" w:fill="FFFFFF"/>
+        </w:rPr>
+        <w:t>Uehiro</w:t>
+      </w:r>
+      <w:proofErr w:type="spellEnd"/>
+      <w:r>
+        <w:rPr>
+          <w:color w:val="32363A"/>
+          <w:shd w:val="clear" w:color="auto" w:fill="FFFFFF"/>
+        </w:rPr>
+        <w:t xml:space="preserve"> Oxford Institute, University of Oxford</w:t>
       </w:r>
     </w:p>
     <w:p>
@@ -5106,22 +5510,32 @@
         </w:rPr>
         <w:t>Ana Gantman (</w:t>
       </w:r>
-      <w:hyperlink r:id="rId34">
-        <w:r>
-          <w:rPr>
-            <w:rStyle w:val="Hyperlink"/>
-            <w:shd w:val="clear" w:color="auto" w:fill="FFFFFF"/>
-            <w:lang w:val="pl-PL"/>
-          </w:rPr>
-          <w:t>ana.gantman@brooklyn.cuny.edu</w:t>
-        </w:r>
-      </w:hyperlink>
-      <w:r>
-        <w:rPr>
-          <w:color w:val="32363A"/>
+      <w:r>
+        <w:fldChar w:fldCharType="begin"/>
+      </w:r>
+      <w:r>
+        <w:instrText>HYPERLINK "mailto:ana.gantman@brooklyn.cuny.edu" \h</w:instrText>
+      </w:r>
+      <w:r>
+        <w:fldChar w:fldCharType="separate"/>
+      </w:r>
+      <w:r>
+        <w:rPr>
+          <w:rStyle w:val="Hyperlink"/>
           <w:shd w:val="clear" w:color="auto" w:fill="FFFFFF"/>
           <w:lang w:val="pl-PL"/>
         </w:rPr>
+        <w:t>ana.gantman@brooklyn.cuny.edu</w:t>
+      </w:r>
+      <w:r>
+        <w:fldChar w:fldCharType="end"/>
+      </w:r>
+      <w:r>
+        <w:rPr>
+          <w:color w:val="32363A"/>
+          <w:shd w:val="clear" w:color="auto" w:fill="FFFFFF"/>
+          <w:lang w:val="pl-PL"/>
+        </w:rPr>
         <w:t xml:space="preserve">) </w:t>
       </w:r>
     </w:p>
@@ -5154,7 +5568,7 @@
         </w:rPr>
         <w:t>Eric R. Igou (</w:t>
       </w:r>
-      <w:hyperlink r:id="rId35">
+      <w:hyperlink r:id="rId30">
         <w:r>
           <w:rPr>
             <w:rStyle w:val="Hyperlink"/>
@@ -5200,7 +5614,7 @@
         </w:rPr>
         <w:t>Elaine L. Kinsella (</w:t>
       </w:r>
-      <w:hyperlink r:id="rId36">
+      <w:hyperlink r:id="rId31">
         <w:r>
           <w:rPr>
             <w:rStyle w:val="Hyperlink"/>
@@ -5248,22 +5662,32 @@
         </w:rPr>
         <w:t>Marek McGann (</w:t>
       </w:r>
-      <w:hyperlink r:id="rId37">
-        <w:r>
-          <w:rPr>
-            <w:rStyle w:val="Hyperlink"/>
-            <w:shd w:val="clear" w:color="auto" w:fill="FFFFFF"/>
-            <w:lang w:val="pl-PL"/>
-          </w:rPr>
-          <w:t>marek.mcgann@mic.ul.ie</w:t>
-        </w:r>
-      </w:hyperlink>
-      <w:r>
-        <w:rPr>
-          <w:color w:val="32363A"/>
+      <w:r>
+        <w:fldChar w:fldCharType="begin"/>
+      </w:r>
+      <w:r>
+        <w:instrText>HYPERLINK "mailto:marek.mcgann@mic.ul.ie" \h</w:instrText>
+      </w:r>
+      <w:r>
+        <w:fldChar w:fldCharType="separate"/>
+      </w:r>
+      <w:r>
+        <w:rPr>
+          <w:rStyle w:val="Hyperlink"/>
           <w:shd w:val="clear" w:color="auto" w:fill="FFFFFF"/>
           <w:lang w:val="pl-PL"/>
         </w:rPr>
+        <w:t>marek.mcgann@mic.ul.ie</w:t>
+      </w:r>
+      <w:r>
+        <w:fldChar w:fldCharType="end"/>
+      </w:r>
+      <w:r>
+        <w:rPr>
+          <w:color w:val="32363A"/>
+          <w:shd w:val="clear" w:color="auto" w:fill="FFFFFF"/>
+          <w:lang w:val="pl-PL"/>
+        </w:rPr>
         <w:t xml:space="preserve">) </w:t>
       </w:r>
     </w:p>
@@ -5298,22 +5722,32 @@
         </w:rPr>
         <w:t>Bryan C.Y. Pang (</w:t>
       </w:r>
-      <w:hyperlink r:id="rId38">
-        <w:r>
-          <w:rPr>
-            <w:rStyle w:val="Hyperlink"/>
-            <w:shd w:val="clear" w:color="auto" w:fill="FFFFFF"/>
-            <w:lang w:val="pl-PL"/>
-          </w:rPr>
-          <w:t>bryan.pang2506@gmail.com</w:t>
-        </w:r>
-      </w:hyperlink>
-      <w:r>
-        <w:rPr>
-          <w:color w:val="32363A"/>
+      <w:r>
+        <w:fldChar w:fldCharType="begin"/>
+      </w:r>
+      <w:r>
+        <w:instrText>HYPERLINK "mailto:bryan.pang2506@gmail.com" \h</w:instrText>
+      </w:r>
+      <w:r>
+        <w:fldChar w:fldCharType="separate"/>
+      </w:r>
+      <w:r>
+        <w:rPr>
+          <w:rStyle w:val="Hyperlink"/>
           <w:shd w:val="clear" w:color="auto" w:fill="FFFFFF"/>
           <w:lang w:val="pl-PL"/>
         </w:rPr>
+        <w:t>bryan.pang2506@gmail.com</w:t>
+      </w:r>
+      <w:r>
+        <w:fldChar w:fldCharType="end"/>
+      </w:r>
+      <w:r>
+        <w:rPr>
+          <w:color w:val="32363A"/>
+          <w:shd w:val="clear" w:color="auto" w:fill="FFFFFF"/>
+          <w:lang w:val="pl-PL"/>
+        </w:rPr>
         <w:t xml:space="preserve">) </w:t>
       </w:r>
     </w:p>
@@ -5348,22 +5782,32 @@
         </w:rPr>
         <w:t>Mariola Paruzel-Czachura (</w:t>
       </w:r>
-      <w:hyperlink r:id="rId39">
-        <w:r>
-          <w:rPr>
-            <w:rStyle w:val="Hyperlink"/>
-            <w:shd w:val="clear" w:color="auto" w:fill="FFFFFF"/>
-            <w:lang w:val="pl-PL"/>
-          </w:rPr>
-          <w:t>mariola.paruzel-czachura@us.edu.pl</w:t>
-        </w:r>
-      </w:hyperlink>
-      <w:r>
-        <w:rPr>
-          <w:color w:val="32363A"/>
+      <w:r>
+        <w:fldChar w:fldCharType="begin"/>
+      </w:r>
+      <w:r>
+        <w:instrText>HYPERLINK "mailto:mariola.paruzel-czachura@us.edu.pl" \h</w:instrText>
+      </w:r>
+      <w:r>
+        <w:fldChar w:fldCharType="separate"/>
+      </w:r>
+      <w:r>
+        <w:rPr>
+          <w:rStyle w:val="Hyperlink"/>
           <w:shd w:val="clear" w:color="auto" w:fill="FFFFFF"/>
           <w:lang w:val="pl-PL"/>
         </w:rPr>
+        <w:t>mariola.paruzel-czachura@us.edu.pl</w:t>
+      </w:r>
+      <w:r>
+        <w:fldChar w:fldCharType="end"/>
+      </w:r>
+      <w:r>
+        <w:rPr>
+          <w:color w:val="32363A"/>
+          <w:shd w:val="clear" w:color="auto" w:fill="FFFFFF"/>
+          <w:lang w:val="pl-PL"/>
+        </w:rPr>
         <w:t xml:space="preserve">) </w:t>
       </w:r>
     </w:p>
@@ -5379,7 +5823,23 @@
           <w:color w:val="32363A"/>
           <w:shd w:val="clear" w:color="auto" w:fill="FFFFFF"/>
         </w:rPr>
-        <w:t xml:space="preserve">Department of Psychology, University of Silesia in Katowice &amp; Perelman School of Medicine, ChatLab, University of Pennsylvania </w:t>
+        <w:t xml:space="preserve">Department of Psychology, University of Silesia in Katowice &amp; Perelman School of Medicine, </w:t>
+      </w:r>
+      <w:proofErr w:type="spellStart"/>
+      <w:r>
+        <w:rPr>
+          <w:color w:val="32363A"/>
+          <w:shd w:val="clear" w:color="auto" w:fill="FFFFFF"/>
+        </w:rPr>
+        <w:t>ChatLab</w:t>
+      </w:r>
+      <w:proofErr w:type="spellEnd"/>
+      <w:r>
+        <w:rPr>
+          <w:color w:val="32363A"/>
+          <w:shd w:val="clear" w:color="auto" w:fill="FFFFFF"/>
+        </w:rPr>
+        <w:t xml:space="preserve">, University of Pennsylvania </w:t>
       </w:r>
     </w:p>
     <w:p>
@@ -5398,7 +5858,7 @@
         </w:rPr>
         <w:t>Cristián G. Rodríguez (</w:t>
       </w:r>
-      <w:hyperlink r:id="rId40">
+      <w:hyperlink r:id="rId32">
         <w:r>
           <w:rPr>
             <w:rStyle w:val="Hyperlink"/>
@@ -5429,7 +5889,23 @@
           <w:color w:val="32363A"/>
           <w:shd w:val="clear" w:color="auto" w:fill="FFFFFF"/>
         </w:rPr>
-        <w:t xml:space="preserve">Department of Psychology, Universidad de los Andes, Chile </w:t>
+        <w:t xml:space="preserve">Department of Psychology, Universidad de </w:t>
+      </w:r>
+      <w:proofErr w:type="spellStart"/>
+      <w:r>
+        <w:rPr>
+          <w:color w:val="32363A"/>
+          <w:shd w:val="clear" w:color="auto" w:fill="FFFFFF"/>
+        </w:rPr>
+        <w:t>los</w:t>
+      </w:r>
+      <w:proofErr w:type="spellEnd"/>
+      <w:r>
+        <w:rPr>
+          <w:color w:val="32363A"/>
+          <w:shd w:val="clear" w:color="auto" w:fill="FFFFFF"/>
+        </w:rPr>
+        <w:t xml:space="preserve"> Andes, Chile </w:t>
       </w:r>
     </w:p>
     <w:p>
@@ -5451,7 +5927,7 @@
         </w:rPr>
         <w:t>Jordan Wylie (</w:t>
       </w:r>
-      <w:hyperlink r:id="rId41">
+      <w:hyperlink r:id="rId33">
         <w:r>
           <w:rPr>
             <w:rStyle w:val="Hyperlink"/>
@@ -5516,7 +5992,7 @@
           <w:color w:val="32363A"/>
           <w:shd w:val="clear" w:color="auto" w:fill="FFFFFF"/>
         </w:rPr>
-        <w:t>This research study has received Ethics approval from the Education and Health Sciences Research Ethics Committee (“-“). If you have any concerns about this study and wish to contact someone independent you may contact:</w:t>
+        <w:t>This research study has received Ethics approval from the Education and Health Sciences Research Ethics Committee (</w:t>
       </w:r>
       <w:r>
         <w:rPr>
@@ -5527,7 +6003,7 @@
           <w:color w:val="32363A"/>
           <w:shd w:val="clear" w:color="auto" w:fill="FFFFFF"/>
         </w:rPr>
-        <w:br/>
+        <w:t>2026_01_16_EHS</w:t>
       </w:r>
       <w:r>
         <w:rPr>
@@ -5538,6 +6014,52 @@
           <w:color w:val="32363A"/>
           <w:shd w:val="clear" w:color="auto" w:fill="FFFFFF"/>
         </w:rPr>
+        <w:t xml:space="preserve">). If you have any concerns about this study and wish to contact someone </w:t>
+      </w:r>
+      <w:proofErr w:type="gramStart"/>
+      <w:r>
+        <w:rPr>
+          <w:b/>
+          <w:bCs/>
+          <w:i/>
+          <w:iCs/>
+          <w:color w:val="32363A"/>
+          <w:shd w:val="clear" w:color="auto" w:fill="FFFFFF"/>
+        </w:rPr>
+        <w:t>independent</w:t>
+      </w:r>
+      <w:proofErr w:type="gramEnd"/>
+      <w:r>
+        <w:rPr>
+          <w:b/>
+          <w:bCs/>
+          <w:i/>
+          <w:iCs/>
+          <w:color w:val="32363A"/>
+          <w:shd w:val="clear" w:color="auto" w:fill="FFFFFF"/>
+        </w:rPr>
+        <w:t xml:space="preserve"> you may contact:</w:t>
+      </w:r>
+      <w:r>
+        <w:rPr>
+          <w:b/>
+          <w:bCs/>
+          <w:i/>
+          <w:iCs/>
+          <w:color w:val="32363A"/>
+          <w:shd w:val="clear" w:color="auto" w:fill="FFFFFF"/>
+        </w:rPr>
+        <w:br/>
+      </w:r>
+      <w:r>
+        <w:rPr>
+          <w:b/>
+          <w:bCs/>
+          <w:i/>
+          <w:iCs/>
+          <w:color w:val="32363A"/>
+          <w:shd w:val="clear" w:color="auto" w:fill="FFFFFF"/>
+        </w:rPr>
         <w:br/>
         <w:t>Chair Education and Health Sciences Research Ethics Committee, EHS Faculty Office, University of Limerick, Tel (061) 234101</w:t>
       </w:r>
@@ -5618,7 +6140,47 @@
     </w:p>
     <w:p>
       <w:r>
-        <w:t>Imagine that in Europe, a woman is near death from a very bad disease, a special kind of cancer. There is one drug that the doctors think might save her. It is a form of radium for which a druggist is charging ten times what the drug cost him to make. The sick woman's husband, Heinz, has approached everyone he knows to borrow the money, but he has only been able to get together about half of what it cost. He has told the druggist that his wife was dying, and asked him to sell it cheaper or let him pay later. But the druggist said, "No, I discovered the drug and I'm going to make money from it." So, Heinz gets desperate and brakes into the man's store to steal the drug for his wife. The druggist has Heinz arrested and charged.</w:t>
+        <w:t xml:space="preserve">Imagine that in Europe, a woman is near death from a very bad disease, a special kind of cancer. There is one drug that the doctors think might save her. It is a form of radium for which a druggist </w:t>
+      </w:r>
+      <w:proofErr w:type="gramStart"/>
+      <w:r>
+        <w:t>is charging</w:t>
+      </w:r>
+      <w:proofErr w:type="gramEnd"/>
+      <w:r>
+        <w:t xml:space="preserve"> ten times what the drug cost him to make. The sick woman's husband, Heinz, has approached everyone he knows to borrow the money, but he has only been able to </w:t>
+      </w:r>
+      <w:proofErr w:type="gramStart"/>
+      <w:r>
+        <w:t>get together</w:t>
+      </w:r>
+      <w:proofErr w:type="gramEnd"/>
+      <w:r>
+        <w:t xml:space="preserve"> about half of what it cost. He </w:t>
+      </w:r>
+      <w:proofErr w:type="gramStart"/>
+      <w:r>
+        <w:t>has</w:t>
+      </w:r>
+      <w:proofErr w:type="gramEnd"/>
+      <w:r>
+        <w:t xml:space="preserve"> told the druggist that his wife was </w:t>
+      </w:r>
+      <w:proofErr w:type="gramStart"/>
+      <w:r>
+        <w:t>dying, and</w:t>
+      </w:r>
+      <w:proofErr w:type="gramEnd"/>
+      <w:r>
+        <w:t xml:space="preserve"> asked him to sell it cheaper or let him pay later. But the druggist said, "No, I discovered the drug and I'm going to make money from it." So, Heinz gets desperate and </w:t>
+      </w:r>
+      <w:proofErr w:type="gramStart"/>
+      <w:r>
+        <w:t>brakes</w:t>
+      </w:r>
+      <w:proofErr w:type="gramEnd"/>
+      <w:r>
+        <w:t xml:space="preserve"> into the man's store to steal the drug for his wife. The druggist has Heinz arrested and charged.</w:t>
       </w:r>
     </w:p>
     <w:p/>
@@ -5698,7 +6260,39 @@
     </w:p>
     <w:p>
       <w:r>
-        <w:t>Imagine a person called Jennifer. She works in a medical school pathology lab as a research assistant. The lab prepares human cadavers that are used to teach medical students about anatomy. The cadavers come from people who had donated their body for the general use of the researchers in the lab. The bodies are normally cremated, however, severed cuts may be disposed of at the discretion of lab researchers, One night Jennifer is leaving the lab when she sees a body that is going to be discarded the next day. Jennifer was a vegetarian, for moral reasons. She thought it was wrong to kill animals for food. But then, when she saw a body about to be cremated, she thought it was irrational to waste perfectly edible meat. So she cut off a piece of flesh, and took it home and cooked it. The person had died recently of a heart attack, and she cooked the meat thoroughly, so there was no risk of disease</w:t>
+        <w:t xml:space="preserve">Imagine a person called Jennifer. She works in a medical school pathology lab as a research assistant. The lab prepares human cadavers that are used to teach medical students about anatomy. The cadavers come from people who had donated their body for the general use of the researchers in the lab. The bodies are normally </w:t>
+      </w:r>
+      <w:proofErr w:type="gramStart"/>
+      <w:r>
+        <w:t>cremated,</w:t>
+      </w:r>
+      <w:proofErr w:type="gramEnd"/>
+      <w:r>
+        <w:t xml:space="preserve"> however, severed cuts may be disposed of at the discretion of lab researchers, </w:t>
+      </w:r>
+      <w:proofErr w:type="gramStart"/>
+      <w:r>
+        <w:t>One</w:t>
+      </w:r>
+      <w:proofErr w:type="gramEnd"/>
+      <w:r>
+        <w:t xml:space="preserve"> night Jennifer is leaving the lab when she sees a body that is going to be discarded the next day. Jennifer was a vegetarian, for moral reasons. She thought it was wrong to kill animals for food. But then, when she saw a body about to be cremated, she thought it was irrational to waste perfectly edible meat. </w:t>
+      </w:r>
+      <w:proofErr w:type="gramStart"/>
+      <w:r>
+        <w:t>So</w:t>
+      </w:r>
+      <w:proofErr w:type="gramEnd"/>
+      <w:r>
+        <w:t xml:space="preserve"> she cut off a piece of </w:t>
+      </w:r>
+      <w:proofErr w:type="gramStart"/>
+      <w:r>
+        <w:t>flesh, and</w:t>
+      </w:r>
+      <w:proofErr w:type="gramEnd"/>
+      <w:r>
+        <w:t xml:space="preserve"> took it home and cooked it. The person had died recently of a heart attack, and she cooked the meat thoroughly, so there was no risk of disease</w:t>
       </w:r>
     </w:p>
     <w:p/>
@@ -5782,7 +6376,21 @@
         <w:rPr>
           <w:lang w:val="en-IE" w:eastAsia="zh-CN"/>
         </w:rPr>
-        <w:t>How would you rate the behavior described?</w:t>
+        <w:t xml:space="preserve">How would you rate the </w:t>
+      </w:r>
+      <w:proofErr w:type="spellStart"/>
+      <w:r>
+        <w:rPr>
+          <w:lang w:val="en-IE" w:eastAsia="zh-CN"/>
+        </w:rPr>
+        <w:t>behavior</w:t>
+      </w:r>
+      <w:proofErr w:type="spellEnd"/>
+      <w:r>
+        <w:rPr>
+          <w:lang w:val="en-IE" w:eastAsia="zh-CN"/>
+        </w:rPr>
+        <w:t xml:space="preserve"> described?</w:t>
       </w:r>
     </w:p>
     <w:p>
@@ -5931,7 +6539,21 @@
         <w:rPr>
           <w:color w:val="000000" w:themeColor="text1"/>
         </w:rPr>
-        <w:t>Do you agree that the druggist has to make a living?</w:t>
+        <w:t xml:space="preserve">Do you agree that the druggist </w:t>
+      </w:r>
+      <w:proofErr w:type="gramStart"/>
+      <w:r>
+        <w:rPr>
+          <w:color w:val="000000" w:themeColor="text1"/>
+        </w:rPr>
+        <w:t>has to</w:t>
+      </w:r>
+      <w:proofErr w:type="gramEnd"/>
+      <w:r>
+        <w:rPr>
+          <w:color w:val="000000" w:themeColor="text1"/>
+        </w:rPr>
+        <w:t xml:space="preserve"> make a living?</w:t>
       </w:r>
     </w:p>
     <w:p>
@@ -6059,7 +6681,21 @@
         <w:rPr>
           <w:color w:val="000000" w:themeColor="text1"/>
         </w:rPr>
-        <w:t>Do you agree that in stopping the trolley Paul saved the lives of five people?</w:t>
+        <w:t xml:space="preserve">Do you agree that </w:t>
+      </w:r>
+      <w:proofErr w:type="gramStart"/>
+      <w:r>
+        <w:rPr>
+          <w:color w:val="000000" w:themeColor="text1"/>
+        </w:rPr>
+        <w:t>in</w:t>
+      </w:r>
+      <w:proofErr w:type="gramEnd"/>
+      <w:r>
+        <w:rPr>
+          <w:color w:val="000000" w:themeColor="text1"/>
+        </w:rPr>
+        <w:t xml:space="preserve"> stopping the trolley Paul saved the lives of five people?</w:t>
       </w:r>
     </w:p>
     <w:p>
@@ -6107,7 +6743,21 @@
         <w:rPr>
           <w:color w:val="000000" w:themeColor="text1"/>
         </w:rPr>
-        <w:t>The body had been donated for research, it was to be discarded the next day. You must agree then that it had obviously fulfilled its purpose?</w:t>
+        <w:t xml:space="preserve">The body had been donated for </w:t>
+      </w:r>
+      <w:proofErr w:type="gramStart"/>
+      <w:r>
+        <w:rPr>
+          <w:color w:val="000000" w:themeColor="text1"/>
+        </w:rPr>
+        <w:t>research,</w:t>
+      </w:r>
+      <w:proofErr w:type="gramEnd"/>
+      <w:r>
+        <w:rPr>
+          <w:color w:val="000000" w:themeColor="text1"/>
+        </w:rPr>
+        <w:t xml:space="preserve"> it was to be discarded the next day. You must agree then that it had obviously fulfilled its purpose?</w:t>
       </w:r>
     </w:p>
     <w:p>
@@ -6195,7 +6845,21 @@
         <w:rPr>
           <w:color w:val="000000" w:themeColor="text1"/>
         </w:rPr>
-        <w:t>Do you not agree that any concerns regarding reproductive complications are eased by their using of two forms of contraception?</w:t>
+        <w:t xml:space="preserve">Do you not agree that any concerns regarding reproductive complications are eased by their </w:t>
+      </w:r>
+      <w:proofErr w:type="gramStart"/>
+      <w:r>
+        <w:rPr>
+          <w:color w:val="000000" w:themeColor="text1"/>
+        </w:rPr>
+        <w:t>using</w:t>
+      </w:r>
+      <w:proofErr w:type="gramEnd"/>
+      <w:r>
+        <w:rPr>
+          <w:color w:val="000000" w:themeColor="text1"/>
+        </w:rPr>
+        <w:t xml:space="preserve"> of two forms of contraception?</w:t>
       </w:r>
     </w:p>
     <w:p>
@@ -6378,7 +7042,21 @@
         <w:rPr>
           <w:color w:val="000000" w:themeColor="text1"/>
         </w:rPr>
-        <w:t>Jennifer's actions did not harm anyone, or negatively affect anyone.</w:t>
+        <w:t xml:space="preserve">Jennifer's actions did not harm </w:t>
+      </w:r>
+      <w:proofErr w:type="gramStart"/>
+      <w:r>
+        <w:rPr>
+          <w:color w:val="000000" w:themeColor="text1"/>
+        </w:rPr>
+        <w:t>anyone, or</w:t>
+      </w:r>
+      <w:proofErr w:type="gramEnd"/>
+      <w:r>
+        <w:rPr>
+          <w:color w:val="000000" w:themeColor="text1"/>
+        </w:rPr>
+        <w:t xml:space="preserve"> negatively affect anyone.</w:t>
       </w:r>
     </w:p>
     <w:p>
@@ -6446,7 +7124,21 @@
         <w:rPr>
           <w:color w:val="000000" w:themeColor="text1"/>
         </w:rPr>
-        <w:t>Julie and Mark's actions did not harm anyone, or negatively affect anyone.</w:t>
+        <w:t xml:space="preserve">Julie and Mark's actions did not harm </w:t>
+      </w:r>
+      <w:proofErr w:type="gramStart"/>
+      <w:r>
+        <w:rPr>
+          <w:color w:val="000000" w:themeColor="text1"/>
+        </w:rPr>
+        <w:t>anyone, or</w:t>
+      </w:r>
+      <w:proofErr w:type="gramEnd"/>
+      <w:r>
+        <w:rPr>
+          <w:color w:val="000000" w:themeColor="text1"/>
+        </w:rPr>
+        <w:t xml:space="preserve"> negatively affect anyone.</w:t>
       </w:r>
     </w:p>
     <w:p>
@@ -6558,7 +7250,25 @@
           <w:bCs/>
           <w:color w:val="000000" w:themeColor="text1"/>
         </w:rPr>
-        <w:t>Response options (randomised order)</w:t>
+        <w:t>Response options (</w:t>
+      </w:r>
+      <w:proofErr w:type="spellStart"/>
+      <w:r>
+        <w:rPr>
+          <w:b/>
+          <w:bCs/>
+          <w:color w:val="000000" w:themeColor="text1"/>
+        </w:rPr>
+        <w:t>randomised</w:t>
+      </w:r>
+      <w:proofErr w:type="spellEnd"/>
+      <w:r>
+        <w:rPr>
+          <w:b/>
+          <w:bCs/>
+          <w:color w:val="000000" w:themeColor="text1"/>
+        </w:rPr>
+        <w:t xml:space="preserve"> order)</w:t>
       </w:r>
     </w:p>
     <w:p>
@@ -6705,8 +7415,16 @@
         <w:rPr>
           <w:color w:val="000000" w:themeColor="text1"/>
         </w:rPr>
-        <w:t>Not at all       Extremely confused</w:t>
-      </w:r>
+        <w:t xml:space="preserve">Not at all       Extremely </w:t>
+      </w:r>
+      <w:proofErr w:type="gramStart"/>
+      <w:r>
+        <w:rPr>
+          <w:color w:val="000000" w:themeColor="text1"/>
+        </w:rPr>
+        <w:t>confused</w:t>
+      </w:r>
+      <w:proofErr w:type="gramEnd"/>
     </w:p>
     <w:p>
       <w:pPr>
@@ -6939,7 +7657,21 @@
         <w:rPr>
           <w:lang w:val="en-IE" w:eastAsia="zh-CN"/>
         </w:rPr>
-        <w:t>In the following you will read several situations of people making decisions. After you read each scenario you will be asked a series of questions, including making a judgment.</w:t>
+        <w:t xml:space="preserve">In the following you will read several situations of people making decisions. After you read each </w:t>
+      </w:r>
+      <w:proofErr w:type="gramStart"/>
+      <w:r>
+        <w:rPr>
+          <w:lang w:val="en-IE" w:eastAsia="zh-CN"/>
+        </w:rPr>
+        <w:t>scenario</w:t>
+      </w:r>
+      <w:proofErr w:type="gramEnd"/>
+      <w:r>
+        <w:rPr>
+          <w:lang w:val="en-IE" w:eastAsia="zh-CN"/>
+        </w:rPr>
+        <w:t xml:space="preserve"> you will be asked a series of questions, including making a judgment.</w:t>
       </w:r>
     </w:p>
     <w:p>
@@ -7044,7 +7776,21 @@
         <w:rPr>
           <w:lang w:val="en-IE" w:eastAsia="zh-CN"/>
         </w:rPr>
-        <w:t>In the following you will read several situations of people making decisions. After you read each scenario you will be asked a series of questions, including making a judgment.</w:t>
+        <w:t xml:space="preserve">In the following you will read several situations of people making decisions. After you read each </w:t>
+      </w:r>
+      <w:proofErr w:type="gramStart"/>
+      <w:r>
+        <w:rPr>
+          <w:lang w:val="en-IE" w:eastAsia="zh-CN"/>
+        </w:rPr>
+        <w:t>scenario</w:t>
+      </w:r>
+      <w:proofErr w:type="gramEnd"/>
+      <w:r>
+        <w:rPr>
+          <w:lang w:val="en-IE" w:eastAsia="zh-CN"/>
+        </w:rPr>
+        <w:t xml:space="preserve"> you will be asked a series of questions, including making a judgment.</w:t>
       </w:r>
     </w:p>
     <w:p>
@@ -7217,7 +7963,21 @@
         <w:rPr>
           <w:lang w:val="en-IE" w:eastAsia="zh-CN"/>
         </w:rPr>
-        <w:t>In the following you will read several situations of people making decisions. After you read each scenario you will be asked a series of questions, including making a judgment.</w:t>
+        <w:t xml:space="preserve">In the following you will read several situations of people making decisions. After you read each </w:t>
+      </w:r>
+      <w:proofErr w:type="gramStart"/>
+      <w:r>
+        <w:rPr>
+          <w:lang w:val="en-IE" w:eastAsia="zh-CN"/>
+        </w:rPr>
+        <w:t>scenario</w:t>
+      </w:r>
+      <w:proofErr w:type="gramEnd"/>
+      <w:r>
+        <w:rPr>
+          <w:lang w:val="en-IE" w:eastAsia="zh-CN"/>
+        </w:rPr>
+        <w:t xml:space="preserve"> you will be asked a series of questions, including making a judgment.</w:t>
       </w:r>
     </w:p>
     <w:p>
@@ -7414,133 +8174,19 @@
           <w:i/>
           <w:iCs/>
         </w:rPr>
-        <w:t>How Task (Concrete)</w:t>
-      </w:r>
-    </w:p>
-    <w:p>
-      <w:pPr>
-        <w:spacing w:after="160" w:line="278" w:lineRule="auto"/>
-      </w:pPr>
-      <w:r>
-        <w:t>For everything we do, there always is a process of how we do it. Moreover, we often can follow our broad life-goals down to our very specific behaviors. For example, like most people, you probably hope to find happiness in life. How can you do this? Perhaps finding a good job, or being educated, can help. How can you do these things? Perhaps by earning a college degree. How do you earn a college degree? By satisfying course requirements. How do you satisfy course requirements? In some cases, such as today, you participate in a psychology experiment. Research suggests that engaging in thought exercise like that above, in which one thinks about how one's ultimate life goals can be expressed through specific actions, can improve people's life satisfaction. In this experiment, we are testing such a technique. This thought exercise is intended to focus your attention on how you do the things you do.</w:t>
-      </w:r>
-    </w:p>
-    <w:p>
-      <w:pPr>
-        <w:spacing w:after="160" w:line="278" w:lineRule="auto"/>
-      </w:pPr>
-      <w:r>
-        <w:t>For this thought exercise, please consider the following activity: "improving and maintaining one's physical health."</w:t>
-      </w:r>
-    </w:p>
-    <w:p>
-      <w:pPr>
-        <w:spacing w:after="160" w:line="278" w:lineRule="auto"/>
-      </w:pPr>
-      <w:r>
-        <w:t>________</w:t>
-      </w:r>
-    </w:p>
-    <w:p>
-      <w:pPr>
-        <w:spacing w:after="160" w:line="278" w:lineRule="auto"/>
-      </w:pPr>
-      <w:r>
-        <w:t>Please list three ways in which you can improve your health:</w:t>
-      </w:r>
-    </w:p>
-    <w:p>
-      <w:pPr>
-        <w:spacing w:after="160" w:line="278" w:lineRule="auto"/>
-      </w:pPr>
-      <w:r>
-        <w:t>________</w:t>
-      </w:r>
-    </w:p>
-    <w:p>
-      <w:pPr>
-        <w:spacing w:after="160" w:line="278" w:lineRule="auto"/>
-      </w:pPr>
-      <w:r>
-        <w:t>How much will engaging in this activity improve and maintain your health?</w:t>
-      </w:r>
-    </w:p>
-    <w:p>
-      <w:pPr>
-        <w:spacing w:after="160" w:line="278" w:lineRule="auto"/>
-      </w:pPr>
-      <w:r>
-        <w:t>1       2       3       4       5</w:t>
-      </w:r>
-    </w:p>
-    <w:p>
-      <w:pPr>
-        <w:spacing w:after="160" w:line="278" w:lineRule="auto"/>
-      </w:pPr>
-      <w:r>
-        <w:t>A little                      Very, very much</w:t>
-      </w:r>
-    </w:p>
-    <w:p>
-      <w:pPr>
-        <w:spacing w:after="160" w:line="278" w:lineRule="auto"/>
-      </w:pPr>
-      <w:r>
-        <w:t>________</w:t>
-      </w:r>
-    </w:p>
-    <w:p>
-      <w:pPr>
-        <w:spacing w:after="160" w:line="278" w:lineRule="auto"/>
-      </w:pPr>
-      <w:r>
-        <w:t>Starting with the goal outlined in the top box, please identify how you might achieve this and enter your answer into the second box. Next, think about the response you just provided and identify how you might achieve this; enter your answer in the box. Work your way through the boxes until you have entered a response into all boxes. Your first response should identify how you might improve and maintain your health</w:t>
-      </w:r>
-    </w:p>
-    <w:p>
-      <w:pPr>
-        <w:spacing w:after="160" w:line="278" w:lineRule="auto"/>
-      </w:pPr>
-      <w:r>
-        <w:t>You entered _______. How would you _______?</w:t>
-      </w:r>
-    </w:p>
-    <w:p>
-      <w:pPr>
-        <w:spacing w:after="160" w:line="278" w:lineRule="auto"/>
-      </w:pPr>
-      <w:r>
-        <w:t>You entered _______. How would you _______?</w:t>
-      </w:r>
-    </w:p>
-    <w:p>
-      <w:pPr>
-        <w:spacing w:after="160" w:line="278" w:lineRule="auto"/>
-      </w:pPr>
-      <w:r>
-        <w:t>You entered _______. How would you _______?</w:t>
-      </w:r>
-    </w:p>
-    <w:p>
-      <w:pPr>
-        <w:spacing w:after="160" w:line="278" w:lineRule="auto"/>
-      </w:pPr>
-    </w:p>
-    <w:p>
-      <w:pPr>
-        <w:spacing w:after="160" w:line="278" w:lineRule="auto"/>
-      </w:pPr>
-    </w:p>
-    <w:p>
-      <w:pPr>
-        <w:spacing w:after="160" w:line="278" w:lineRule="auto"/>
+        <w:t xml:space="preserve">How </w:t>
+      </w:r>
+      <w:proofErr w:type="gramStart"/>
+      <w:r>
         <w:rPr>
           <w:b/>
           <w:bCs/>
           <w:i/>
           <w:iCs/>
         </w:rPr>
-      </w:pPr>
+        <w:t>Task</w:t>
+      </w:r>
+      <w:proofErr w:type="gramEnd"/>
       <w:r>
         <w:rPr>
           <w:b/>
@@ -7548,6 +8194,156 @@
           <w:i/>
           <w:iCs/>
         </w:rPr>
+        <w:t xml:space="preserve"> (Concrete)</w:t>
+      </w:r>
+    </w:p>
+    <w:p>
+      <w:pPr>
+        <w:spacing w:after="160" w:line="278" w:lineRule="auto"/>
+      </w:pPr>
+      <w:r>
+        <w:t xml:space="preserve">For everything we do, there always is a process of how we do it. Moreover, we often can follow our broad </w:t>
+      </w:r>
+      <w:proofErr w:type="gramStart"/>
+      <w:r>
+        <w:t>life-goals</w:t>
+      </w:r>
+      <w:proofErr w:type="gramEnd"/>
+      <w:r>
+        <w:t xml:space="preserve"> down to our very specific behaviors. For example, like most people, you probably hope to find happiness in life. How can you do this? Perhaps finding a good job, or being educated, can help. How can you do these things? Perhaps by earning a college degree. How do you earn a college degree? By satisfying course requirements. How do you satisfy course requirements? In some cases, such as today, you participate in a psychology experiment. Research suggests that engaging in thought exercise like that above, in which one thinks about how one's ultimate life goals can be expressed through specific actions, can improve people's life satisfaction. In this experiment, we are testing such a technique. This thought exercise is intended to focus your attention on how you do the things you do.</w:t>
+      </w:r>
+    </w:p>
+    <w:p>
+      <w:pPr>
+        <w:spacing w:after="160" w:line="278" w:lineRule="auto"/>
+      </w:pPr>
+      <w:r>
+        <w:t>For this thought exercise, please consider the following activity: "improving and maintaining one's physical health."</w:t>
+      </w:r>
+    </w:p>
+    <w:p>
+      <w:pPr>
+        <w:spacing w:after="160" w:line="278" w:lineRule="auto"/>
+      </w:pPr>
+      <w:r>
+        <w:t>________</w:t>
+      </w:r>
+    </w:p>
+    <w:p>
+      <w:pPr>
+        <w:spacing w:after="160" w:line="278" w:lineRule="auto"/>
+      </w:pPr>
+      <w:r>
+        <w:t>Please list three ways in which you can improve your health:</w:t>
+      </w:r>
+    </w:p>
+    <w:p>
+      <w:pPr>
+        <w:spacing w:after="160" w:line="278" w:lineRule="auto"/>
+      </w:pPr>
+      <w:r>
+        <w:t>________</w:t>
+      </w:r>
+    </w:p>
+    <w:p>
+      <w:pPr>
+        <w:spacing w:after="160" w:line="278" w:lineRule="auto"/>
+      </w:pPr>
+      <w:r>
+        <w:t xml:space="preserve">How much will </w:t>
+      </w:r>
+      <w:proofErr w:type="gramStart"/>
+      <w:r>
+        <w:t>engaging</w:t>
+      </w:r>
+      <w:proofErr w:type="gramEnd"/>
+      <w:r>
+        <w:t xml:space="preserve"> in this activity improve and maintain your health?</w:t>
+      </w:r>
+    </w:p>
+    <w:p>
+      <w:pPr>
+        <w:spacing w:after="160" w:line="278" w:lineRule="auto"/>
+      </w:pPr>
+      <w:r>
+        <w:t>1       2       3       4       5</w:t>
+      </w:r>
+    </w:p>
+    <w:p>
+      <w:pPr>
+        <w:spacing w:after="160" w:line="278" w:lineRule="auto"/>
+      </w:pPr>
+      <w:r>
+        <w:t>A little                      Very, very much</w:t>
+      </w:r>
+    </w:p>
+    <w:p>
+      <w:pPr>
+        <w:spacing w:after="160" w:line="278" w:lineRule="auto"/>
+      </w:pPr>
+      <w:r>
+        <w:t>________</w:t>
+      </w:r>
+    </w:p>
+    <w:p>
+      <w:pPr>
+        <w:spacing w:after="160" w:line="278" w:lineRule="auto"/>
+      </w:pPr>
+      <w:r>
+        <w:t>Starting with the goal outlined in the top box, please identify how you might achieve this and enter your answer into the second box. Next, think about the response you just provided and identify how you might achieve this; enter your answer in the box. Work your way through the boxes until you have entered a response into all boxes. Your first response should identify how you might improve and maintain your health</w:t>
+      </w:r>
+    </w:p>
+    <w:p>
+      <w:pPr>
+        <w:spacing w:after="160" w:line="278" w:lineRule="auto"/>
+      </w:pPr>
+      <w:r>
+        <w:t>You entered _______. How would you _______?</w:t>
+      </w:r>
+    </w:p>
+    <w:p>
+      <w:pPr>
+        <w:spacing w:after="160" w:line="278" w:lineRule="auto"/>
+      </w:pPr>
+      <w:r>
+        <w:t>You entered _______. How would you _______?</w:t>
+      </w:r>
+    </w:p>
+    <w:p>
+      <w:pPr>
+        <w:spacing w:after="160" w:line="278" w:lineRule="auto"/>
+      </w:pPr>
+      <w:r>
+        <w:t>You entered _______. How would you _______?</w:t>
+      </w:r>
+    </w:p>
+    <w:p>
+      <w:pPr>
+        <w:spacing w:after="160" w:line="278" w:lineRule="auto"/>
+      </w:pPr>
+    </w:p>
+    <w:p>
+      <w:pPr>
+        <w:spacing w:after="160" w:line="278" w:lineRule="auto"/>
+      </w:pPr>
+    </w:p>
+    <w:p>
+      <w:pPr>
+        <w:spacing w:after="160" w:line="278" w:lineRule="auto"/>
+        <w:rPr>
+          <w:b/>
+          <w:bCs/>
+          <w:i/>
+          <w:iCs/>
+        </w:rPr>
+      </w:pPr>
+      <w:r>
+        <w:rPr>
+          <w:b/>
+          <w:bCs/>
+          <w:i/>
+          <w:iCs/>
+        </w:rPr>
         <w:lastRenderedPageBreak/>
         <w:t xml:space="preserve">Why Task (Abstract) </w:t>
       </w:r>
@@ -7557,7 +8353,41 @@
         <w:spacing w:after="160" w:line="278" w:lineRule="auto"/>
       </w:pPr>
       <w:r>
-        <w:t>For every thing we do, there always is a reason why we do it. Moreover, we often can trace the causes of our behavior back to broad life-goals that we have. For example, you currently are participating in a psychology experiment. Why are you doing this? Perhaps to satisfy a course requirement. Why are you satisfying the course requirement? Perhaps to pass a psychology course. Why pass the course? Perhaps because you want to earn a college degree. Why earn a college degree? Maybe because you want to find a good job, or because you want to educate yourself. And perhaps you wish to educate yourself or find a good job because you feel that doing so can bring you happiness in life. Research suggests that engaging in thought exercises like that above, in which one thinks about how one's actions relate to one's ultimate life goals, can improve people's life satisfaction. In this experiment, we are testing such a technique. This thought exercise is intended to focus your attention on why you do the things you do.</w:t>
+        <w:t xml:space="preserve">For </w:t>
+      </w:r>
+      <w:proofErr w:type="spellStart"/>
+      <w:proofErr w:type="gramStart"/>
+      <w:r>
+        <w:t>every thing</w:t>
+      </w:r>
+      <w:proofErr w:type="spellEnd"/>
+      <w:proofErr w:type="gramEnd"/>
+      <w:r>
+        <w:t xml:space="preserve"> we do, there always is a reason why we do it. Moreover, we often can trace the causes of our behavior back to broad </w:t>
+      </w:r>
+      <w:proofErr w:type="gramStart"/>
+      <w:r>
+        <w:t>life-goals</w:t>
+      </w:r>
+      <w:proofErr w:type="gramEnd"/>
+      <w:r>
+        <w:t xml:space="preserve"> that we have. For example, you currently are participating in a psychology experiment. Why are you doing this? Perhaps to satisfy a course requirement. Why are you satisfying the course requirement? Perhaps to pass a psychology course. Why pass the course? Perhaps because you want to earn a college degree. Why earn a college degree? Maybe because you want to find a good job, or because you want to educate yourself. And perhaps you wish to educate yourself or find a good job because you feel that doing so can bring you happiness in life. Research suggests that engaging </w:t>
+      </w:r>
+      <w:proofErr w:type="gramStart"/>
+      <w:r>
+        <w:t>in thought</w:t>
+      </w:r>
+      <w:proofErr w:type="gramEnd"/>
+      <w:r>
+        <w:t xml:space="preserve"> exercises like that above, in which one thinks about how one's actions relate to one's ultimate life </w:t>
+      </w:r>
+      <w:proofErr w:type="gramStart"/>
+      <w:r>
+        <w:t>goals,</w:t>
+      </w:r>
+      <w:proofErr w:type="gramEnd"/>
+      <w:r>
+        <w:t xml:space="preserve"> can improve people's life satisfaction. In this experiment, we are testing such a technique. This thought exercise is intended to focus your attention on why you do the things you do.</w:t>
       </w:r>
     </w:p>
     <w:p>
@@ -7602,7 +8432,15 @@
         <w:spacing w:after="160" w:line="278" w:lineRule="auto"/>
       </w:pPr>
       <w:r>
-        <w:t>How much will improving and maintaining your health help you meet this important goal?</w:t>
+        <w:t xml:space="preserve">How much will </w:t>
+      </w:r>
+      <w:proofErr w:type="gramStart"/>
+      <w:r>
+        <w:t>improving</w:t>
+      </w:r>
+      <w:proofErr w:type="gramEnd"/>
+      <w:r>
+        <w:t xml:space="preserve"> and maintaining your health help you meet this important goal?</w:t>
       </w:r>
     </w:p>
     <w:p>
@@ -7626,7 +8464,15 @@
         <w:spacing w:after="160" w:line="278" w:lineRule="auto"/>
       </w:pPr>
       <w:r>
-        <w:t>Starting with the goal outlined in the bottom box, please identify why you might want to achieve this and enter your answer into the second box. Next, think about the response you just provided and identify why you might want achieve this; enter your answer in the next box. Work your way through the boxes until you have entered a response into all boxes. Your first response should identify why you might want to improve and maintain your health</w:t>
+        <w:t xml:space="preserve">Starting with the goal outlined in the bottom box, please identify why you might want to achieve this and enter your answer into the second box. Next, think about the response you just provided and identify why you might want </w:t>
+      </w:r>
+      <w:proofErr w:type="gramStart"/>
+      <w:r>
+        <w:t>achieve</w:t>
+      </w:r>
+      <w:proofErr w:type="gramEnd"/>
+      <w:r>
+        <w:t xml:space="preserve"> this; enter your answer in the next box. Work your way through the boxes until you have entered a response into all boxes. Your first response should identify why you might want to improve and maintain your health</w:t>
       </w:r>
     </w:p>
     <w:p>
@@ -7722,7 +8568,7 @@
                     </pic:cNvPicPr>
                   </pic:nvPicPr>
                   <pic:blipFill>
-                    <a:blip r:embed="rId42"/>
+                    <a:blip r:embed="rId34"/>
                     <a:stretch>
                       <a:fillRect/>
                     </a:stretch>
@@ -8024,7 +8870,7 @@
                     </pic:cNvPicPr>
                   </pic:nvPicPr>
                   <pic:blipFill>
-                    <a:blip r:embed="rId43"/>
+                    <a:blip r:embed="rId35"/>
                     <a:stretch>
                       <a:fillRect/>
                     </a:stretch>
@@ -8077,7 +8923,7 @@
                     </pic:cNvPicPr>
                   </pic:nvPicPr>
                   <pic:blipFill>
-                    <a:blip r:embed="rId44"/>
+                    <a:blip r:embed="rId36"/>
                     <a:stretch>
                       <a:fillRect/>
                     </a:stretch>
@@ -8115,13 +8961,29 @@
         </w:rPr>
       </w:pPr>
       <w:bookmarkStart w:id="15" w:name="_Toc218610930"/>
+      <w:proofErr w:type="spellStart"/>
       <w:r>
         <w:rPr>
           <w:lang w:val="pt-BR"/>
         </w:rPr>
-        <w:t>Appendix O: References</w:t>
+        <w:t>Appendix</w:t>
+      </w:r>
+      <w:proofErr w:type="spellEnd"/>
+      <w:r>
+        <w:rPr>
+          <w:lang w:val="pt-BR"/>
+        </w:rPr>
+        <w:t xml:space="preserve"> O: </w:t>
+      </w:r>
+      <w:proofErr w:type="spellStart"/>
+      <w:r>
+        <w:rPr>
+          <w:lang w:val="pt-BR"/>
+        </w:rPr>
+        <w:t>References</w:t>
       </w:r>
       <w:bookmarkEnd w:id="15"/>
+      <w:proofErr w:type="spellEnd"/>
     </w:p>
     <w:p>
       <w:pPr>
@@ -8135,7 +8997,21 @@
         <w:rPr>
           <w:lang w:val="pt-BR" w:eastAsia="zh-CN"/>
         </w:rPr>
-        <w:t xml:space="preserve">Freitas, A. L., Gollwitzer, P., &amp; Trope, Y. (2004). </w:t>
+        <w:t xml:space="preserve">Freitas, A. L., </w:t>
+      </w:r>
+      <w:proofErr w:type="spellStart"/>
+      <w:r>
+        <w:rPr>
+          <w:lang w:val="pt-BR" w:eastAsia="zh-CN"/>
+        </w:rPr>
+        <w:t>Gollwitzer</w:t>
+      </w:r>
+      <w:proofErr w:type="spellEnd"/>
+      <w:r>
+        <w:rPr>
+          <w:lang w:val="pt-BR" w:eastAsia="zh-CN"/>
+        </w:rPr>
+        <w:t xml:space="preserve">, P., &amp; Trope, Y. (2004). </w:t>
       </w:r>
       <w:r>
         <w:rPr>
@@ -8171,7 +9047,7 @@
         </w:rPr>
         <w:t xml:space="preserve">(6), 739–752. </w:t>
       </w:r>
-      <w:hyperlink r:id="rId45">
+      <w:hyperlink r:id="rId37">
         <w:r>
           <w:rPr>
             <w:rStyle w:val="Hyperlink"/>
@@ -8229,7 +9105,7 @@
         </w:rPr>
         <w:t xml:space="preserve">(3), 351–367. </w:t>
       </w:r>
-      <w:hyperlink r:id="rId46">
+      <w:hyperlink r:id="rId38">
         <w:r>
           <w:rPr>
             <w:rStyle w:val="Hyperlink"/>
@@ -8253,26 +9129,46 @@
         </w:rPr>
         <w:t xml:space="preserve">McHugh, C., McGann, M., Igou, E. R., &amp; Kinsella, E. L. (2017). Searching for Moral Dumbfounding: Identifying Measurable Indicators of Moral Dumbfounding. </w:t>
       </w:r>
+      <w:proofErr w:type="spellStart"/>
+      <w:proofErr w:type="gramStart"/>
       <w:r>
         <w:rPr>
           <w:i/>
           <w:iCs/>
           <w:lang w:val="fr-BE" w:eastAsia="zh-CN"/>
         </w:rPr>
-        <w:t>Collabra: Psychology</w:t>
-      </w:r>
-      <w:r>
-        <w:rPr>
-          <w:lang w:val="fr-BE" w:eastAsia="zh-CN"/>
-        </w:rPr>
-        <w:t xml:space="preserve">, </w:t>
-      </w:r>
+        <w:t>Collabra</w:t>
+      </w:r>
+      <w:proofErr w:type="spellEnd"/>
       <w:r>
         <w:rPr>
           <w:i/>
           <w:iCs/>
           <w:lang w:val="fr-BE" w:eastAsia="zh-CN"/>
         </w:rPr>
+        <w:t>:</w:t>
+      </w:r>
+      <w:proofErr w:type="gramEnd"/>
+      <w:r>
+        <w:rPr>
+          <w:i/>
+          <w:iCs/>
+          <w:lang w:val="fr-BE" w:eastAsia="zh-CN"/>
+        </w:rPr>
+        <w:t xml:space="preserve"> Psychology</w:t>
+      </w:r>
+      <w:r>
+        <w:rPr>
+          <w:lang w:val="fr-BE" w:eastAsia="zh-CN"/>
+        </w:rPr>
+        <w:t xml:space="preserve">, </w:t>
+      </w:r>
+      <w:r>
+        <w:rPr>
+          <w:i/>
+          <w:iCs/>
+          <w:lang w:val="fr-BE" w:eastAsia="zh-CN"/>
+        </w:rPr>
         <w:t>3</w:t>
       </w:r>
       <w:r>
@@ -8281,7 +9177,7 @@
         </w:rPr>
         <w:t xml:space="preserve">(1), 1–24. </w:t>
       </w:r>
-      <w:hyperlink r:id="rId47">
+      <w:hyperlink r:id="rId39">
         <w:r>
           <w:rPr>
             <w:color w:val="0000FF"/>
@@ -8340,7 +9236,7 @@
         </w:rPr>
         <w:t xml:space="preserve">(1), 73818. </w:t>
       </w:r>
-      <w:hyperlink r:id="rId48">
+      <w:hyperlink r:id="rId40">
         <w:r>
           <w:rPr>
             <w:color w:val="0000FF"/>
@@ -8393,7 +9289,7 @@
         </w:rPr>
         <w:t xml:space="preserve">(5), 1043–1060. </w:t>
       </w:r>
-      <w:hyperlink r:id="rId49">
+      <w:hyperlink r:id="rId41">
         <w:r>
           <w:rPr>
             <w:color w:val="0000FF"/>
@@ -8414,9 +9310,8 @@
       </w:pPr>
     </w:p>
     <w:sectPr>
-      <w:headerReference w:type="even" r:id="rId50"/>
-      <w:headerReference w:type="default" r:id="rId51"/>
-      <w:headerReference w:type="first" r:id="rId52"/>
+      <w:headerReference w:type="default" r:id="rId42"/>
+      <w:headerReference w:type="first" r:id="rId43"/>
       <w:pgSz w:w="12240" w:h="15840"/>
       <w:pgMar w:top="1440" w:right="1440" w:bottom="1440" w:left="1440" w:header="720" w:footer="0" w:gutter="0"/>
       <w:cols w:space="708"/>
@@ -8466,16 +9361,6 @@
 </file>
 
 <file path=word/header1.xml><?xml version="1.0" encoding="utf-8"?>
-<w:hdr xmlns:wpc="http://schemas.microsoft.com/office/word/2010/wordprocessingCanvas" xmlns:cx="http://schemas.microsoft.com/office/drawing/2014/chartex" xmlns:cx1="http://schemas.microsoft.com/office/drawing/2015/9/8/chartex" xmlns:cx2="http://schemas.microsoft.com/office/drawing/2015/10/21/chartex" xmlns:cx3="http://schemas.microsoft.com/office/drawing/2016/5/9/chartex" xmlns:cx4="http://schemas.microsoft.com/office/drawing/2016/5/10/chartex" xmlns:cx5="http://schemas.microsoft.com/office/drawing/2016/5/11/chartex" xmlns:cx6="http://schemas.microsoft.com/office/drawing/2016/5/12/chartex" xmlns:cx7="http://schemas.microsoft.com/office/drawing/2016/5/13/chartex" xmlns:cx8="http://schemas.microsoft.com/office/drawing/2016/5/14/chartex" xmlns:mc="http://schemas.openxmlformats.org/markup-compatibility/2006" xmlns:aink="http://schemas.microsoft.com/office/drawing/2016/ink" xmlns:am3d="http://schemas.microsoft.com/office/drawing/2017/model3d" xmlns:o="urn:schemas-microsoft-com:office:office" xmlns:oel="http://schemas.microsoft.com/office/2019/extlst" xmlns:r="http://schemas.openxmlformats.org/officeDocument/2006/relationships" xmlns:m="http://schemas.openxmlformats.org/officeDocument/2006/math" xmlns:v="urn:schemas-microsoft-com:vml" xmlns:wp14="http://schemas.microsoft.com/office/word/2010/wordprocessingDrawing" xmlns:wp="http://schemas.openxmlformats.org/drawingml/2006/wordprocessingDrawing" xmlns:w10="urn:schemas-microsoft-com:office:word" xmlns:w="http://schemas.openxmlformats.org/wordprocessingml/2006/main" xmlns:w14="http://schemas.microsoft.com/office/word/2010/wordml" xmlns:w15="http://schemas.microsoft.com/office/word/2012/wordml" xmlns:w16cex="http://schemas.microsoft.com/office/word/2018/wordml/cex" xmlns:w16cid="http://schemas.microsoft.com/office/word/2016/wordml/cid" xmlns:w16="http://schemas.microsoft.com/office/word/2018/wordml" xmlns:w16du="http://schemas.microsoft.com/office/word/2023/wordml/word16du" xmlns:w16sdtdh="http://schemas.microsoft.com/office/word/2020/wordml/sdtdatahash" xmlns:w16sdtfl="http://schemas.microsoft.com/office/word/2024/wordml/sdtformatlock" xmlns:w16se="http://schemas.microsoft.com/office/word/2015/wordml/symex" xmlns:wpg="http://schemas.microsoft.com/office/word/2010/wordprocessingGroup" xmlns:wpi="http://schemas.microsoft.com/office/word/2010/wordprocessingInk" xmlns:wne="http://schemas.microsoft.com/office/word/2006/wordml" xmlns:wps="http://schemas.microsoft.com/office/word/2010/wordprocessingShape" mc:Ignorable="w14 w15 w16se w16cid w16 w16cex w16sdtdh w16sdtfl w16du wp14">
-  <w:p>
-    <w:pPr>
-      <w:pStyle w:val="Header"/>
-    </w:pPr>
-  </w:p>
-</w:hdr>
-</file>
-
-<file path=word/header2.xml><?xml version="1.0" encoding="utf-8"?>
 <w:hdr xmlns:wpc="http://schemas.microsoft.com/office/word/2010/wordprocessingCanvas" xmlns:cx="http://schemas.microsoft.com/office/drawing/2014/chartex" xmlns:cx1="http://schemas.microsoft.com/office/drawing/2015/9/8/chartex" xmlns:cx2="http://schemas.microsoft.com/office/drawing/2015/10/21/chartex" xmlns:cx3="http://schemas.microsoft.com/office/drawing/2016/5/9/chartex" xmlns:cx4="http://schemas.microsoft.com/office/drawing/2016/5/10/chartex" xmlns:cx5="http://schemas.microsoft.com/office/drawing/2016/5/11/chartex" xmlns:cx6="http://schemas.microsoft.com/office/drawing/2016/5/12/chartex" xmlns:cx7="http://schemas.microsoft.com/office/drawing/2016/5/13/chartex" xmlns:cx8="http://schemas.microsoft.com/office/drawing/2016/5/14/chartex" xmlns:mc="http://schemas.openxmlformats.org/markup-compatibility/2006" xmlns:aink="http://schemas.microsoft.com/office/drawing/2016/ink" xmlns:am3d="http://schemas.microsoft.com/office/drawing/2017/model3d" xmlns:o="urn:schemas-microsoft-com:office:office" xmlns:oel="http://schemas.microsoft.com/office/2019/extlst" xmlns:r="http://schemas.openxmlformats.org/officeDocument/2006/relationships" xmlns:m="http://schemas.openxmlformats.org/officeDocument/2006/math" xmlns:v="urn:schemas-microsoft-com:vml" xmlns:wp14="http://schemas.microsoft.com/office/word/2010/wordprocessingDrawing" xmlns:wp="http://schemas.openxmlformats.org/drawingml/2006/wordprocessingDrawing" xmlns:w10="urn:schemas-microsoft-com:office:word" xmlns:w="http://schemas.openxmlformats.org/wordprocessingml/2006/main" xmlns:w14="http://schemas.microsoft.com/office/word/2010/wordml" xmlns:w15="http://schemas.microsoft.com/office/word/2012/wordml" xmlns:w16cex="http://schemas.microsoft.com/office/word/2018/wordml/cex" xmlns:w16cid="http://schemas.microsoft.com/office/word/2016/wordml/cid" xmlns:w16="http://schemas.microsoft.com/office/word/2018/wordml" xmlns:w16du="http://schemas.microsoft.com/office/word/2023/wordml/word16du" xmlns:w16sdtdh="http://schemas.microsoft.com/office/word/2020/wordml/sdtdatahash" xmlns:w16sdtfl="http://schemas.microsoft.com/office/word/2024/wordml/sdtformatlock" xmlns:w16se="http://schemas.microsoft.com/office/word/2015/wordml/symex" xmlns:wpg="http://schemas.microsoft.com/office/word/2010/wordprocessingGroup" xmlns:wpi="http://schemas.microsoft.com/office/word/2010/wordprocessingInk" xmlns:wne="http://schemas.microsoft.com/office/word/2006/wordml" xmlns:wps="http://schemas.microsoft.com/office/word/2010/wordprocessingShape" mc:Ignorable="w14 w15 w16se w16cid w16 w16cex w16sdtdh w16sdtfl w16du wp14">
   <w:sdt>
     <w:sdtPr>
@@ -8526,7 +9411,7 @@
 </w:hdr>
 </file>
 
-<file path=word/header3.xml><?xml version="1.0" encoding="utf-8"?>
+<file path=word/header2.xml><?xml version="1.0" encoding="utf-8"?>
 <w:hdr xmlns:wpc="http://schemas.microsoft.com/office/word/2010/wordprocessingCanvas" xmlns:cx="http://schemas.microsoft.com/office/drawing/2014/chartex" xmlns:cx1="http://schemas.microsoft.com/office/drawing/2015/9/8/chartex" xmlns:cx2="http://schemas.microsoft.com/office/drawing/2015/10/21/chartex" xmlns:cx3="http://schemas.microsoft.com/office/drawing/2016/5/9/chartex" xmlns:cx4="http://schemas.microsoft.com/office/drawing/2016/5/10/chartex" xmlns:cx5="http://schemas.microsoft.com/office/drawing/2016/5/11/chartex" xmlns:cx6="http://schemas.microsoft.com/office/drawing/2016/5/12/chartex" xmlns:cx7="http://schemas.microsoft.com/office/drawing/2016/5/13/chartex" xmlns:cx8="http://schemas.microsoft.com/office/drawing/2016/5/14/chartex" xmlns:mc="http://schemas.openxmlformats.org/markup-compatibility/2006" xmlns:aink="http://schemas.microsoft.com/office/drawing/2016/ink" xmlns:am3d="http://schemas.microsoft.com/office/drawing/2017/model3d" xmlns:o="urn:schemas-microsoft-com:office:office" xmlns:oel="http://schemas.microsoft.com/office/2019/extlst" xmlns:r="http://schemas.openxmlformats.org/officeDocument/2006/relationships" xmlns:m="http://schemas.openxmlformats.org/officeDocument/2006/math" xmlns:v="urn:schemas-microsoft-com:vml" xmlns:wp14="http://schemas.microsoft.com/office/word/2010/wordprocessingDrawing" xmlns:wp="http://schemas.openxmlformats.org/drawingml/2006/wordprocessingDrawing" xmlns:w10="urn:schemas-microsoft-com:office:word" xmlns:w="http://schemas.openxmlformats.org/wordprocessingml/2006/main" xmlns:w14="http://schemas.microsoft.com/office/word/2010/wordml" xmlns:w15="http://schemas.microsoft.com/office/word/2012/wordml" xmlns:w16cex="http://schemas.microsoft.com/office/word/2018/wordml/cex" xmlns:w16cid="http://schemas.microsoft.com/office/word/2016/wordml/cid" xmlns:w16="http://schemas.microsoft.com/office/word/2018/wordml" xmlns:w16du="http://schemas.microsoft.com/office/word/2023/wordml/word16du" xmlns:w16sdtdh="http://schemas.microsoft.com/office/word/2020/wordml/sdtdatahash" xmlns:w16sdtfl="http://schemas.microsoft.com/office/word/2024/wordml/sdtformatlock" xmlns:w16se="http://schemas.microsoft.com/office/word/2015/wordml/symex" xmlns:wpg="http://schemas.microsoft.com/office/word/2010/wordprocessingGroup" xmlns:wpi="http://schemas.microsoft.com/office/word/2010/wordprocessingInk" xmlns:wne="http://schemas.microsoft.com/office/word/2006/wordml" xmlns:wps="http://schemas.microsoft.com/office/word/2010/wordprocessingShape" mc:Ignorable="w14 w15 w16se w16cid w16 w16cex w16sdtdh w16sdtfl w16du wp14">
   <w:sdt>
     <w:sdtPr>
@@ -9779,7 +10664,6 @@
   <w:style w:type="character" w:default="1" w:styleId="DefaultParagraphFont">
     <w:name w:val="Default Paragraph Font"/>
     <w:uiPriority w:val="1"/>
-    <w:semiHidden/>
     <w:unhideWhenUsed/>
   </w:style>
   <w:style w:type="table" w:default="1" w:styleId="TableNormal">

</xml_diff>